<commit_message>
Update technical deep-dive with killinfo corrections
Key corrections:
- Kill #99 FBG RSS = 681 MB (not 2.5GB as assumed)
- killinfo dirty pages = 0 at kill moment (challenges dirty_ratio hypothesis)
- Mitigation dirty_ratio effect marked as pending verification
- Added complete Kill #99 memory snapshot
- Need monitor.sh data to verify dirty pages peak during copy
</commit_message>
<xml_diff>
--- a/technical-deep-dive.docx
+++ b/technical-deep-dive.docx
@@ -2,7 +2,7 @@
 <file path=word/document.xml><?xml version="1.0" encoding="utf-8"?>
 <w:document xmlns:w="http://schemas.openxmlformats.org/wordprocessingml/2006/main" xmlns:m="http://schemas.openxmlformats.org/officeDocument/2006/math" xmlns:r="http://schemas.openxmlformats.org/officeDocument/2006/relationships" xmlns:o="urn:schemas-microsoft-com:office:office" xmlns:v="urn:schemas-microsoft-com:vml" xmlns:w10="urn:schemas-microsoft-com:office:word" xmlns:a="http://schemas.openxmlformats.org/drawingml/2006/main" xmlns:pic="http://schemas.openxmlformats.org/drawingml/2006/picture" xmlns:wp="http://schemas.openxmlformats.org/drawingml/2006/wordprocessingDrawing">
   <w:body>
-    <w:bookmarkStart w:id="36" w:name="thrpi-354-oom-技術深度分析"/>
+    <w:bookmarkStart w:id="38" w:name="thrpi-354-oom-技術深度分析"/>
     <w:p>
       <w:pPr>
         <w:pStyle w:val="Heading1"/>
@@ -3733,7 +3733,7 @@
     </w:p>
     <w:bookmarkEnd w:id="17"/>
     <w:bookmarkEnd w:id="18"/>
-    <w:bookmarkStart w:id="24" w:name="bugreport-數據驗證"/>
+    <w:bookmarkStart w:id="26" w:name="bugreport-數據驗證"/>
     <w:p>
       <w:pPr>
         <w:pStyle w:val="Heading2"/>
@@ -4504,19 +4504,28 @@
       </w:r>
     </w:p>
     <w:bookmarkEnd w:id="20"/>
-    <w:bookmarkStart w:id="21" w:name="dirty-pages-是真正的元兇"/>
+    <w:bookmarkStart w:id="21" w:name="kill-99-files-by-google-被-kill-時的完整快照"/>
     <w:p>
       <w:pPr>
         <w:pStyle w:val="Heading3"/>
       </w:pPr>
       <w:r>
-        <w:t xml:space="preserve">3.3 Dirty Pages </w:t>
-      </w:r>
-      <w:r>
-        <w:rPr>
-          <w:rFonts w:hint="eastAsia"/>
-        </w:rPr>
-        <w:t xml:space="preserve">是真正的元兇</w:t>
+        <w:t xml:space="preserve">3.3 Kill #99 — Files by Google </w:t>
+      </w:r>
+      <w:r>
+        <w:rPr>
+          <w:rFonts w:hint="eastAsia"/>
+        </w:rPr>
+        <w:t xml:space="preserve">被</w:t>
+      </w:r>
+      <w:r>
+        <w:t xml:space="preserve"> Kill </w:t>
+      </w:r>
+      <w:r>
+        <w:rPr>
+          <w:rFonts w:hint="eastAsia"/>
+        </w:rPr>
+        <w:t xml:space="preserve">時的完整快照</w:t>
       </w:r>
     </w:p>
     <w:p>
@@ -4526,169 +4535,52 @@
       <w:r>
         <w:rPr>
           <w:rStyle w:val="VerbatimChar"/>
-          <w:rFonts w:hint="eastAsia"/>
-        </w:rPr>
-        <w:t xml:space="preserve">之前的假設（部分錯誤）：</w:t>
-      </w:r>
-      <w:r>
-        <w:br/>
-      </w:r>
-      <w:r>
-        <w:rPr>
-          <w:rStyle w:val="VerbatimChar"/>
-        </w:rPr>
-        <w:t xml:space="preserve">  Files by Google Java heap </w:t>
-      </w:r>
-      <w:r>
-        <w:rPr>
-          <w:rStyle w:val="VerbatimChar"/>
-          <w:rFonts w:hint="eastAsia"/>
-        </w:rPr>
-        <w:t xml:space="preserve">膨脹</w:t>
-      </w:r>
-      <w:r>
-        <w:rPr>
-          <w:rStyle w:val="VerbatimChar"/>
-        </w:rPr>
-        <w:t xml:space="preserve"> 2.5GB → </w:t>
-      </w:r>
-      <w:r>
-        <w:rPr>
-          <w:rStyle w:val="VerbatimChar"/>
-          <w:rFonts w:hint="eastAsia"/>
-        </w:rPr>
-        <w:t xml:space="preserve">擠掉</w:t>
-      </w:r>
-      <w:r>
-        <w:rPr>
-          <w:rStyle w:val="VerbatimChar"/>
-        </w:rPr>
-        <w:t xml:space="preserve"> file cache → thrashing</w:t>
-      </w:r>
-      <w:r>
-        <w:br/>
-      </w:r>
-      <w:r>
-        <w:br/>
-      </w:r>
-      <w:r>
-        <w:rPr>
-          <w:rStyle w:val="VerbatimChar"/>
-        </w:rPr>
-        <w:t xml:space="preserve">bugreport </w:t>
-      </w:r>
-      <w:r>
-        <w:rPr>
-          <w:rStyle w:val="VerbatimChar"/>
-          <w:rFonts w:hint="eastAsia"/>
-        </w:rPr>
-        <w:t xml:space="preserve">實際數據：</w:t>
-      </w:r>
-      <w:r>
-        <w:br/>
-      </w:r>
-      <w:r>
-        <w:rPr>
-          <w:rStyle w:val="VerbatimChar"/>
-        </w:rPr>
-        <w:t xml:space="preserve">  Anonymous memory </w:t>
-      </w:r>
-      <w:r>
-        <w:rPr>
-          <w:rStyle w:val="VerbatimChar"/>
-          <w:rFonts w:hint="eastAsia"/>
-        </w:rPr>
-        <w:t xml:space="preserve">沒有膨脹（反而下降</w:t>
-      </w:r>
-      <w:r>
-        <w:rPr>
-          <w:rStyle w:val="VerbatimChar"/>
-        </w:rPr>
-        <w:t xml:space="preserve"> 279 </w:t>
-      </w:r>
-      <w:r>
-        <w:rPr>
-          <w:rStyle w:val="VerbatimChar"/>
-          <w:rFonts w:hint="eastAsia"/>
-        </w:rPr>
-        <w:t xml:space="preserve">MB）</w:t>
-      </w:r>
-      <w:r>
-        <w:br/>
-      </w:r>
-      <w:r>
-        <w:rPr>
-          <w:rStyle w:val="VerbatimChar"/>
-        </w:rPr>
-        <w:t xml:space="preserve">  File cache </w:t>
-      </w:r>
-      <w:r>
-        <w:rPr>
-          <w:rStyle w:val="VerbatimChar"/>
-          <w:rFonts w:hint="eastAsia"/>
-        </w:rPr>
-        <w:t xml:space="preserve">消失的</w:t>
-      </w:r>
-      <w:r>
-        <w:rPr>
-          <w:rStyle w:val="VerbatimChar"/>
-        </w:rPr>
-        <w:t xml:space="preserve"> 3603 MB </w:t>
-      </w:r>
-      <w:r>
-        <w:rPr>
-          <w:rStyle w:val="VerbatimChar"/>
-          <w:rFonts w:hint="eastAsia"/>
-        </w:rPr>
-        <w:t xml:space="preserve">主要變成了</w:t>
-      </w:r>
-      <w:r>
-        <w:rPr>
-          <w:rStyle w:val="VerbatimChar"/>
-        </w:rPr>
-        <w:t xml:space="preserve"> FreeMem</w:t>
-      </w:r>
-      <w:r>
-        <w:br/>
-      </w:r>
-      <w:r>
-        <w:br/>
-      </w:r>
-      <w:r>
-        <w:rPr>
-          <w:rStyle w:val="VerbatimChar"/>
-          <w:rFonts w:hint="eastAsia"/>
-        </w:rPr>
-        <w:t xml:space="preserve">正確的因果鏈：</w:t>
-      </w:r>
-      <w:r>
-        <w:br/>
-      </w:r>
-      <w:r>
-        <w:rPr>
-          <w:rStyle w:val="VerbatimChar"/>
-        </w:rPr>
-        <w:t xml:space="preserve">  </w:t>
-      </w:r>
-      <w:r>
-        <w:rPr>
-          <w:rStyle w:val="VerbatimChar"/>
-          <w:rFonts w:hint="eastAsia"/>
-        </w:rPr>
-        <w:t xml:space="preserve">大量</w:t>
-      </w:r>
-      <w:r>
-        <w:rPr>
-          <w:rStyle w:val="VerbatimChar"/>
-        </w:rPr>
-        <w:t xml:space="preserve"> I/O → dirty pages </w:t>
-      </w:r>
-      <w:r>
-        <w:rPr>
-          <w:rStyle w:val="VerbatimChar"/>
-          <w:rFonts w:hint="eastAsia"/>
-        </w:rPr>
-        <w:t xml:space="preserve">堆積到</w:t>
+        </w:rPr>
+        <w:t xml:space="preserve">Kill #99 — pid=4796 (.apps.nbu.files)</w:t>
+      </w:r>
+      <w:r>
+        <w:br/>
+      </w:r>
+      <w:r>
+        <w:rPr>
+          <w:rStyle w:val="VerbatimChar"/>
+        </w:rPr>
+        <w:t xml:space="preserve">Time: 02-09 15:44:47.847</w:t>
+      </w:r>
+      <w:r>
+        <w:br/>
+      </w:r>
+      <w:r>
+        <w:br/>
+      </w:r>
+      <w:r>
+        <w:rPr>
+          <w:rStyle w:val="VerbatimChar"/>
+        </w:rPr>
+        <w:t xml:space="preserve">  oom_score_adj   = 0         ← Foreground </w:t>
+      </w:r>
+      <w:r>
+        <w:rPr>
+          <w:rStyle w:val="VerbatimChar"/>
+          <w:rFonts w:hint="eastAsia"/>
+        </w:rPr>
+        <w:t xml:space="preserve">app（正在使用中）</w:t>
+      </w:r>
+      <w:r>
+        <w:br/>
+      </w:r>
+      <w:r>
+        <w:rPr>
+          <w:rStyle w:val="VerbatimChar"/>
+        </w:rPr>
+        <w:t xml:space="preserve">  min_oom_score   = 0         ← CRITICAL </w:t>
+      </w:r>
+      <w:r>
+        <w:rPr>
+          <w:rStyle w:val="VerbatimChar"/>
+          <w:rFonts w:hint="eastAsia"/>
+        </w:rPr>
+        <w:t xml:space="preserve">層級（連前台都可</w:t>
       </w:r>
       <w:r>
         <w:rPr>
@@ -4701,7 +4593,23 @@
           <w:rStyle w:val="VerbatimChar"/>
           <w:rFonts w:hint="eastAsia"/>
         </w:rPr>
-        <w:t xml:space="preserve">1.2GB（dirty_ratio=20</w:t>
+        <w:t xml:space="preserve">kill）</w:t>
+      </w:r>
+      <w:r>
+        <w:br/>
+      </w:r>
+      <w:r>
+        <w:rPr>
+          <w:rStyle w:val="VerbatimChar"/>
+        </w:rPr>
+        <w:t xml:space="preserve">  tasksize (RSS)  = 681 MB    ← FBG </w:t>
+      </w:r>
+      <w:r>
+        <w:rPr>
+          <w:rStyle w:val="VerbatimChar"/>
+          <w:rFonts w:hint="eastAsia"/>
+        </w:rPr>
+        <w:t xml:space="preserve">實際佔用（不是之前推測的</w:t>
       </w:r>
       <w:r>
         <w:rPr>
@@ -4714,222 +4622,1164 @@
           <w:rStyle w:val="VerbatimChar"/>
           <w:rFonts w:hint="eastAsia"/>
         </w:rPr>
-        <w:t xml:space="preserve">的上限）</w:t>
-      </w:r>
-      <w:r>
-        <w:br/>
-      </w:r>
-      <w:r>
-        <w:rPr>
-          <w:rStyle w:val="VerbatimChar"/>
-        </w:rPr>
-        <w:t xml:space="preserve">  → 1.2GB RAM </w:t>
-      </w:r>
-      <w:r>
-        <w:rPr>
-          <w:rStyle w:val="VerbatimChar"/>
-          <w:rFonts w:hint="eastAsia"/>
-        </w:rPr>
-        <w:t xml:space="preserve">被</w:t>
-      </w:r>
-      <w:r>
-        <w:rPr>
-          <w:rStyle w:val="VerbatimChar"/>
-        </w:rPr>
-        <w:t xml:space="preserve"> dirty pages </w:t>
-      </w:r>
-      <w:r>
-        <w:rPr>
-          <w:rStyle w:val="VerbatimChar"/>
-          <w:rFonts w:hint="eastAsia"/>
-        </w:rPr>
-        <w:t xml:space="preserve">鎖住（不可回收，必須等</w:t>
-      </w:r>
-      <w:r>
-        <w:rPr>
-          <w:rStyle w:val="VerbatimChar"/>
-        </w:rPr>
-        <w:t xml:space="preserve"> </w:t>
-      </w:r>
-      <w:r>
-        <w:rPr>
-          <w:rStyle w:val="VerbatimChar"/>
-          <w:rFonts w:hint="eastAsia"/>
-        </w:rPr>
-        <w:t xml:space="preserve">writeback）</w:t>
-      </w:r>
-      <w:r>
-        <w:br/>
-      </w:r>
-      <w:r>
-        <w:rPr>
-          <w:rStyle w:val="VerbatimChar"/>
-        </w:rPr>
-        <w:t xml:space="preserve">  → kswapd </w:t>
-      </w:r>
-      <w:r>
-        <w:rPr>
-          <w:rStyle w:val="VerbatimChar"/>
-          <w:rFonts w:hint="eastAsia"/>
-        </w:rPr>
-        <w:t xml:space="preserve">被迫回收</w:t>
-      </w:r>
-      <w:r>
-        <w:rPr>
-          <w:rStyle w:val="VerbatimChar"/>
-        </w:rPr>
-        <w:t xml:space="preserve"> clean file cache </w:t>
-      </w:r>
-      <w:r>
-        <w:rPr>
-          <w:rStyle w:val="VerbatimChar"/>
-          <w:rFonts w:hint="eastAsia"/>
-        </w:rPr>
-        <w:t xml:space="preserve">來騰出空間</w:t>
-      </w:r>
-      <w:r>
-        <w:br/>
-      </w:r>
-      <w:r>
-        <w:rPr>
-          <w:rStyle w:val="VerbatimChar"/>
-        </w:rPr>
-        <w:t xml:space="preserve">  → file cache </w:t>
-      </w:r>
-      <w:r>
-        <w:rPr>
-          <w:rStyle w:val="VerbatimChar"/>
-          <w:rFonts w:hint="eastAsia"/>
-        </w:rPr>
-        <w:t xml:space="preserve">從</w:t>
-      </w:r>
-      <w:r>
-        <w:rPr>
-          <w:rStyle w:val="VerbatimChar"/>
-        </w:rPr>
-        <w:t xml:space="preserve"> 3991 MB </w:t>
-      </w:r>
-      <w:r>
-        <w:rPr>
-          <w:rStyle w:val="VerbatimChar"/>
-          <w:rFonts w:hint="eastAsia"/>
-        </w:rPr>
-        <w:t xml:space="preserve">被回收到</w:t>
-      </w:r>
-      <w:r>
-        <w:rPr>
-          <w:rStyle w:val="VerbatimChar"/>
-        </w:rPr>
-        <w:t xml:space="preserve"> 388 MB</w:t>
-      </w:r>
-      <w:r>
-        <w:br/>
-      </w:r>
-      <w:r>
-        <w:rPr>
-          <w:rStyle w:val="VerbatimChar"/>
-        </w:rPr>
-        <w:t xml:space="preserve">  → </w:t>
-      </w:r>
-      <w:r>
-        <w:rPr>
-          <w:rStyle w:val="VerbatimChar"/>
-          <w:rFonts w:hint="eastAsia"/>
-        </w:rPr>
-        <w:t xml:space="preserve">剩餘的</w:t>
-      </w:r>
-      <w:r>
-        <w:rPr>
-          <w:rStyle w:val="VerbatimChar"/>
-        </w:rPr>
-        <w:t xml:space="preserve"> 388 MB </w:t>
-      </w:r>
-      <w:r>
-        <w:rPr>
-          <w:rStyle w:val="VerbatimChar"/>
-          <w:rFonts w:hint="eastAsia"/>
-        </w:rPr>
-        <w:t xml:space="preserve">是</w:t>
-      </w:r>
-      <w:r>
-        <w:rPr>
-          <w:rStyle w:val="VerbatimChar"/>
-        </w:rPr>
-        <w:t xml:space="preserve"> FBG </w:t>
-      </w:r>
-      <w:r>
-        <w:rPr>
-          <w:rStyle w:val="VerbatimChar"/>
-          <w:rFonts w:hint="eastAsia"/>
-        </w:rPr>
-        <w:t xml:space="preserve">的</w:t>
-      </w:r>
-      <w:r>
-        <w:rPr>
-          <w:rStyle w:val="VerbatimChar"/>
-        </w:rPr>
-        <w:t xml:space="preserve"> working set</w:t>
-      </w:r>
-      <w:r>
-        <w:br/>
-      </w:r>
-      <w:r>
-        <w:rPr>
-          <w:rStyle w:val="VerbatimChar"/>
-        </w:rPr>
-        <w:t xml:space="preserve">  → kswapd </w:t>
-      </w:r>
-      <w:r>
-        <w:rPr>
-          <w:rStyle w:val="VerbatimChar"/>
-          <w:rFonts w:hint="eastAsia"/>
-        </w:rPr>
-        <w:t xml:space="preserve">回收它們</w:t>
-      </w:r>
-      <w:r>
-        <w:rPr>
-          <w:rStyle w:val="VerbatimChar"/>
-        </w:rPr>
-        <w:t xml:space="preserve"> → </w:t>
-      </w:r>
-      <w:r>
-        <w:rPr>
-          <w:rStyle w:val="VerbatimChar"/>
-          <w:rFonts w:hint="eastAsia"/>
-        </w:rPr>
-        <w:t xml:space="preserve">立刻</w:t>
-      </w:r>
-      <w:r>
-        <w:rPr>
-          <w:rStyle w:val="VerbatimChar"/>
-        </w:rPr>
-        <w:t xml:space="preserve"> refault → thrashing</w:t>
-      </w:r>
-      <w:r>
-        <w:br/>
-      </w:r>
-      <w:r>
-        <w:rPr>
-          <w:rStyle w:val="VerbatimChar"/>
-        </w:rPr>
-        <w:t xml:space="preserve">  → PSI stall → lmkd kill → Files by Google </w:t>
-      </w:r>
-      <w:r>
-        <w:rPr>
-          <w:rStyle w:val="VerbatimChar"/>
-          <w:rFonts w:hint="eastAsia"/>
-        </w:rPr>
-        <w:t xml:space="preserve">被</w:t>
-      </w:r>
-      <w:r>
-        <w:rPr>
-          <w:rStyle w:val="VerbatimChar"/>
-        </w:rPr>
-        <w:t xml:space="preserve"> kill</w:t>
+        <w:t xml:space="preserve">2.5GB）</w:t>
+      </w:r>
+      <w:r>
+        <w:br/>
+      </w:r>
+      <w:r>
+        <w:rPr>
+          <w:rStyle w:val="VerbatimChar"/>
+        </w:rPr>
+        <w:t xml:space="preserve">  total_vm        = 1668 MB</w:t>
+      </w:r>
+      <w:r>
+        <w:br/>
+      </w:r>
+      <w:r>
+        <w:rPr>
+          <w:rStyle w:val="VerbatimChar"/>
+        </w:rPr>
+        <w:t xml:space="preserve">  free_mem        = 1037 MB</w:t>
+      </w:r>
+      <w:r>
+        <w:br/>
+      </w:r>
+      <w:r>
+        <w:rPr>
+          <w:rStyle w:val="VerbatimChar"/>
+        </w:rPr>
+        <w:t xml:space="preserve">  file_pages      = 618 MB</w:t>
+      </w:r>
+      <w:r>
+        <w:br/>
+      </w:r>
+      <w:r>
+        <w:rPr>
+          <w:rStyle w:val="VerbatimChar"/>
+        </w:rPr>
+        <w:t xml:space="preserve">  inactive_file   = 128 MB    ← </w:t>
+      </w:r>
+      <w:r>
+        <w:rPr>
+          <w:rStyle w:val="VerbatimChar"/>
+          <w:rFonts w:hint="eastAsia"/>
+        </w:rPr>
+        <w:t xml:space="preserve">可回收的</w:t>
+      </w:r>
+      <w:r>
+        <w:rPr>
+          <w:rStyle w:val="VerbatimChar"/>
+        </w:rPr>
+        <w:t xml:space="preserve"> file cache </w:t>
+      </w:r>
+      <w:r>
+        <w:rPr>
+          <w:rStyle w:val="VerbatimChar"/>
+          <w:rFonts w:hint="eastAsia"/>
+        </w:rPr>
+        <w:t xml:space="preserve">幾乎沒了</w:t>
+      </w:r>
+      <w:r>
+        <w:br/>
+      </w:r>
+      <w:r>
+        <w:rPr>
+          <w:rStyle w:val="VerbatimChar"/>
+        </w:rPr>
+        <w:t xml:space="preserve">  active_anon     = 201 MB</w:t>
+      </w:r>
+      <w:r>
+        <w:br/>
+      </w:r>
+      <w:r>
+        <w:rPr>
+          <w:rStyle w:val="VerbatimChar"/>
+        </w:rPr>
+        <w:t xml:space="preserve">  swap_free       = 4185 MB   ← Swap </w:t>
+      </w:r>
+      <w:r>
+        <w:rPr>
+          <w:rStyle w:val="VerbatimChar"/>
+          <w:rFonts w:hint="eastAsia"/>
+        </w:rPr>
+        <w:t xml:space="preserve">幾乎沒用</w:t>
+      </w:r>
+      <w:r>
+        <w:br/>
+      </w:r>
+      <w:r>
+        <w:rPr>
+          <w:rStyle w:val="VerbatimChar"/>
+        </w:rPr>
+        <w:t xml:space="preserve">  PSI full_avg10  = 16.49     ← </w:t>
+      </w:r>
+      <w:r>
+        <w:rPr>
+          <w:rStyle w:val="VerbatimChar"/>
+          <w:rFonts w:hint="eastAsia"/>
+        </w:rPr>
+        <w:t xml:space="preserve">嚴重</w:t>
+      </w:r>
+      <w:r>
+        <w:rPr>
+          <w:rStyle w:val="VerbatimChar"/>
+        </w:rPr>
+        <w:t xml:space="preserve"> full stall</w:t>
+      </w:r>
+      <w:r>
+        <w:br/>
+      </w:r>
+      <w:r>
+        <w:rPr>
+          <w:rStyle w:val="VerbatimChar"/>
+        </w:rPr>
+        <w:t xml:space="preserve">  thrashing%      = 1463%     ← </w:t>
+      </w:r>
+      <w:r>
+        <w:rPr>
+          <w:rStyle w:val="VerbatimChar"/>
+          <w:rFonts w:hint="eastAsia"/>
+        </w:rPr>
+        <w:t xml:space="preserve">遠超</w:t>
+      </w:r>
+      <w:r>
+        <w:rPr>
+          <w:rStyle w:val="VerbatimChar"/>
+        </w:rPr>
+        <w:t xml:space="preserve"> 300% </w:t>
+      </w:r>
+      <w:r>
+        <w:rPr>
+          <w:rStyle w:val="VerbatimChar"/>
+          <w:rFonts w:hint="eastAsia"/>
+        </w:rPr>
+        <w:t xml:space="preserve">門檻</w:t>
       </w:r>
     </w:p>
     <w:bookmarkEnd w:id="21"/>
-    <w:bookmarkStart w:id="22" w:name="kswapd-回收活動證據"/>
+    <w:bookmarkStart w:id="22" w:name="假設修正dirty-pages-堆積-vs-實際數據"/>
+    <w:p>
+      <w:pPr>
+        <w:pStyle w:val="Heading3"/>
+      </w:pPr>
+      <w:r>
+        <w:t xml:space="preserve">3.4 </w:t>
+      </w:r>
+      <w:r>
+        <w:rPr>
+          <w:rFonts w:hint="eastAsia"/>
+        </w:rPr>
+        <w:t xml:space="preserve">假設修正：Dirty</w:t>
+      </w:r>
+      <w:r>
+        <w:t xml:space="preserve"> Pages </w:t>
+      </w:r>
+      <w:r>
+        <w:rPr>
+          <w:rFonts w:hint="eastAsia"/>
+        </w:rPr>
+        <w:t xml:space="preserve">堆積</w:t>
+      </w:r>
+      <w:r>
+        <w:t xml:space="preserve"> vs </w:t>
+      </w:r>
+      <w:r>
+        <w:rPr>
+          <w:rFonts w:hint="eastAsia"/>
+        </w:rPr>
+        <w:t xml:space="preserve">實際數據</w:t>
+      </w:r>
+    </w:p>
+    <w:p>
+      <w:pPr>
+        <w:pStyle w:val="FirstParagraph"/>
+      </w:pPr>
+      <w:r>
+        <w:rPr>
+          <w:rFonts w:hint="eastAsia"/>
+          <w:b/>
+          <w:bCs/>
+        </w:rPr>
+        <w:t xml:space="preserve">重要發現</w:t>
+      </w:r>
+      <w:r>
+        <w:rPr>
+          <w:rFonts w:hint="eastAsia"/>
+        </w:rPr>
+        <w:t xml:space="preserve">：killinfo</w:t>
+      </w:r>
+      <w:r>
+        <w:t xml:space="preserve"> </w:t>
+      </w:r>
+      <w:r>
+        <w:rPr>
+          <w:rFonts w:hint="eastAsia"/>
+        </w:rPr>
+        <w:t xml:space="preserve">中所有</w:t>
+      </w:r>
+      <w:r>
+        <w:t xml:space="preserve"> 121 </w:t>
+      </w:r>
+      <w:r>
+        <w:rPr>
+          <w:rFonts w:hint="eastAsia"/>
+        </w:rPr>
+        <w:t xml:space="preserve">筆的</w:t>
+      </w:r>
+      <w:r>
+        <w:t xml:space="preserve"> dirty pages </w:t>
+      </w:r>
+      <w:r>
+        <w:rPr>
+          <w:rFonts w:hint="eastAsia"/>
+        </w:rPr>
+        <w:t xml:space="preserve">估算值都接近</w:t>
+      </w:r>
+      <w:r>
+        <w:t xml:space="preserve"> 0。</w:t>
+      </w:r>
+    </w:p>
+    <w:p>
+      <w:pPr>
+        <w:pStyle w:val="SourceCode"/>
+      </w:pPr>
+      <w:r>
+        <w:rPr>
+          <w:rStyle w:val="VerbatimChar"/>
+          <w:rFonts w:hint="eastAsia"/>
+        </w:rPr>
+        <w:t xml:space="preserve">之前的假設：</w:t>
+      </w:r>
+      <w:r>
+        <w:br/>
+      </w:r>
+      <w:r>
+        <w:rPr>
+          <w:rStyle w:val="VerbatimChar"/>
+        </w:rPr>
+        <w:t xml:space="preserve">  dirty pages </w:t>
+      </w:r>
+      <w:r>
+        <w:rPr>
+          <w:rStyle w:val="VerbatimChar"/>
+          <w:rFonts w:hint="eastAsia"/>
+        </w:rPr>
+        <w:t xml:space="preserve">堆積到</w:t>
+      </w:r>
+      <w:r>
+        <w:rPr>
+          <w:rStyle w:val="VerbatimChar"/>
+        </w:rPr>
+        <w:t xml:space="preserve"> </w:t>
+      </w:r>
+      <w:r>
+        <w:rPr>
+          <w:rStyle w:val="VerbatimChar"/>
+          <w:rFonts w:hint="eastAsia"/>
+        </w:rPr>
+        <w:t xml:space="preserve">1.2GB（dirty_ratio=20</w:t>
+      </w:r>
+      <w:r>
+        <w:rPr>
+          <w:rStyle w:val="VerbatimChar"/>
+        </w:rPr>
+        <w:t xml:space="preserve"> </w:t>
+      </w:r>
+      <w:r>
+        <w:rPr>
+          <w:rStyle w:val="VerbatimChar"/>
+          <w:rFonts w:hint="eastAsia"/>
+        </w:rPr>
+        <w:t xml:space="preserve">的上限）→</w:t>
+      </w:r>
+      <w:r>
+        <w:rPr>
+          <w:rStyle w:val="VerbatimChar"/>
+        </w:rPr>
+        <w:t xml:space="preserve"> </w:t>
+      </w:r>
+      <w:r>
+        <w:rPr>
+          <w:rStyle w:val="VerbatimChar"/>
+          <w:rFonts w:hint="eastAsia"/>
+        </w:rPr>
+        <w:t xml:space="preserve">擠掉</w:t>
+      </w:r>
+      <w:r>
+        <w:rPr>
+          <w:rStyle w:val="VerbatimChar"/>
+        </w:rPr>
+        <w:t xml:space="preserve"> file cache</w:t>
+      </w:r>
+      <w:r>
+        <w:br/>
+      </w:r>
+      <w:r>
+        <w:br/>
+      </w:r>
+      <w:r>
+        <w:rPr>
+          <w:rStyle w:val="VerbatimChar"/>
+        </w:rPr>
+        <w:t xml:space="preserve">killinfo </w:t>
+      </w:r>
+      <w:r>
+        <w:rPr>
+          <w:rStyle w:val="VerbatimChar"/>
+          <w:rFonts w:hint="eastAsia"/>
+        </w:rPr>
+        <w:t xml:space="preserve">實際數據：</w:t>
+      </w:r>
+      <w:r>
+        <w:br/>
+      </w:r>
+      <w:r>
+        <w:rPr>
+          <w:rStyle w:val="VerbatimChar"/>
+        </w:rPr>
+        <w:t xml:space="preserve">  Kill #1:  file_pages=388MB, active_file=1241MB, inactive_file=256MB</w:t>
+      </w:r>
+      <w:r>
+        <w:br/>
+      </w:r>
+      <w:r>
+        <w:rPr>
+          <w:rStyle w:val="VerbatimChar"/>
+        </w:rPr>
+        <w:t xml:space="preserve">  → dirty ≈ file_pages - active - inactive ≈ 0</w:t>
+      </w:r>
+      <w:r>
+        <w:br/>
+      </w:r>
+      <w:r>
+        <w:br/>
+      </w:r>
+      <w:r>
+        <w:rPr>
+          <w:rStyle w:val="VerbatimChar"/>
+        </w:rPr>
+        <w:t xml:space="preserve">  Kill #99: file_pages=618MB, active_file=1009MB, inactive_file=128MB</w:t>
+      </w:r>
+      <w:r>
+        <w:br/>
+      </w:r>
+      <w:r>
+        <w:rPr>
+          <w:rStyle w:val="VerbatimChar"/>
+        </w:rPr>
+        <w:t xml:space="preserve">  → dirty ≈ 0</w:t>
+      </w:r>
+    </w:p>
+    <w:p>
+      <w:pPr>
+        <w:pStyle w:val="FirstParagraph"/>
+      </w:pPr>
+      <w:r>
+        <w:rPr>
+          <w:rFonts w:hint="eastAsia"/>
+        </w:rPr>
+        <w:t xml:space="preserve">這有兩種解釋：</w:t>
+      </w:r>
+    </w:p>
+    <w:p>
+      <w:pPr>
+        <w:pStyle w:val="SourceCode"/>
+      </w:pPr>
+      <w:r>
+        <w:rPr>
+          <w:rStyle w:val="VerbatimChar"/>
+          <w:rFonts w:hint="eastAsia"/>
+        </w:rPr>
+        <w:t xml:space="preserve">解釋</w:t>
+      </w:r>
+      <w:r>
+        <w:rPr>
+          <w:rStyle w:val="VerbatimChar"/>
+        </w:rPr>
+        <w:t xml:space="preserve"> </w:t>
+      </w:r>
+      <w:r>
+        <w:rPr>
+          <w:rStyle w:val="VerbatimChar"/>
+          <w:rFonts w:hint="eastAsia"/>
+        </w:rPr>
+        <w:t xml:space="preserve">A：killinfo</w:t>
+      </w:r>
+      <w:r>
+        <w:rPr>
+          <w:rStyle w:val="VerbatimChar"/>
+        </w:rPr>
+        <w:t xml:space="preserve"> </w:t>
+      </w:r>
+      <w:r>
+        <w:rPr>
+          <w:rStyle w:val="VerbatimChar"/>
+          <w:rFonts w:hint="eastAsia"/>
+        </w:rPr>
+        <w:t xml:space="preserve">記錄的是</w:t>
+      </w:r>
+      <w:r>
+        <w:rPr>
+          <w:rStyle w:val="VerbatimChar"/>
+        </w:rPr>
+        <w:t xml:space="preserve"> kill </w:t>
+      </w:r>
+      <w:r>
+        <w:rPr>
+          <w:rStyle w:val="VerbatimChar"/>
+          <w:rFonts w:hint="eastAsia"/>
+        </w:rPr>
+        <w:t xml:space="preserve">瞬間的快照</w:t>
+      </w:r>
+      <w:r>
+        <w:br/>
+      </w:r>
+      <w:r>
+        <w:rPr>
+          <w:rStyle w:val="VerbatimChar"/>
+        </w:rPr>
+        <w:t xml:space="preserve">  </w:t>
+      </w:r>
+      <w:r>
+        <w:rPr>
+          <w:rStyle w:val="VerbatimChar"/>
+          <w:rFonts w:hint="eastAsia"/>
+        </w:rPr>
+        <w:t xml:space="preserve">複製過程中</w:t>
+      </w:r>
+      <w:r>
+        <w:rPr>
+          <w:rStyle w:val="VerbatimChar"/>
+        </w:rPr>
+        <w:t xml:space="preserve"> dirty pages </w:t>
+      </w:r>
+      <w:r>
+        <w:rPr>
+          <w:rStyle w:val="VerbatimChar"/>
+          <w:rFonts w:hint="eastAsia"/>
+        </w:rPr>
+        <w:t xml:space="preserve">可能確實很高</w:t>
+      </w:r>
+      <w:r>
+        <w:br/>
+      </w:r>
+      <w:r>
+        <w:rPr>
+          <w:rStyle w:val="VerbatimChar"/>
+        </w:rPr>
+        <w:t xml:space="preserve">  → </w:t>
+      </w:r>
+      <w:r>
+        <w:rPr>
+          <w:rStyle w:val="VerbatimChar"/>
+          <w:rFonts w:hint="eastAsia"/>
+        </w:rPr>
+        <w:t xml:space="preserve">但</w:t>
+      </w:r>
+      <w:r>
+        <w:rPr>
+          <w:rStyle w:val="VerbatimChar"/>
+        </w:rPr>
+        <w:t xml:space="preserve"> writeback </w:t>
+      </w:r>
+      <w:r>
+        <w:rPr>
+          <w:rStyle w:val="VerbatimChar"/>
+          <w:rFonts w:hint="eastAsia"/>
+        </w:rPr>
+        <w:t xml:space="preserve">在</w:t>
+      </w:r>
+      <w:r>
+        <w:rPr>
+          <w:rStyle w:val="VerbatimChar"/>
+        </w:rPr>
+        <w:t xml:space="preserve"> kill </w:t>
+      </w:r>
+      <w:r>
+        <w:rPr>
+          <w:rStyle w:val="VerbatimChar"/>
+          <w:rFonts w:hint="eastAsia"/>
+        </w:rPr>
+        <w:t xml:space="preserve">前已完成</w:t>
+      </w:r>
+      <w:r>
+        <w:br/>
+      </w:r>
+      <w:r>
+        <w:rPr>
+          <w:rStyle w:val="VerbatimChar"/>
+        </w:rPr>
+        <w:t xml:space="preserve">  → killinfo </w:t>
+      </w:r>
+      <w:r>
+        <w:rPr>
+          <w:rStyle w:val="VerbatimChar"/>
+          <w:rFonts w:hint="eastAsia"/>
+        </w:rPr>
+        <w:t xml:space="preserve">拍到的是</w:t>
+      </w:r>
+      <w:r>
+        <w:rPr>
+          <w:rStyle w:val="VerbatimChar"/>
+        </w:rPr>
+        <w:t xml:space="preserve"> dirty=0 </w:t>
+      </w:r>
+      <w:r>
+        <w:rPr>
+          <w:rStyle w:val="VerbatimChar"/>
+          <w:rFonts w:hint="eastAsia"/>
+        </w:rPr>
+        <w:t xml:space="preserve">的瞬間</w:t>
+      </w:r>
+      <w:r>
+        <w:br/>
+      </w:r>
+      <w:r>
+        <w:rPr>
+          <w:rStyle w:val="VerbatimChar"/>
+        </w:rPr>
+        <w:t xml:space="preserve">  → dirty_ratio mitigation </w:t>
+      </w:r>
+      <w:r>
+        <w:rPr>
+          <w:rStyle w:val="VerbatimChar"/>
+          <w:rFonts w:hint="eastAsia"/>
+        </w:rPr>
+        <w:t xml:space="preserve">仍然有效</w:t>
+      </w:r>
+      <w:r>
+        <w:br/>
+      </w:r>
+      <w:r>
+        <w:br/>
+      </w:r>
+      <w:r>
+        <w:rPr>
+          <w:rStyle w:val="VerbatimChar"/>
+          <w:rFonts w:hint="eastAsia"/>
+        </w:rPr>
+        <w:t xml:space="preserve">解釋</w:t>
+      </w:r>
+      <w:r>
+        <w:rPr>
+          <w:rStyle w:val="VerbatimChar"/>
+        </w:rPr>
+        <w:t xml:space="preserve"> </w:t>
+      </w:r>
+      <w:r>
+        <w:rPr>
+          <w:rStyle w:val="VerbatimChar"/>
+          <w:rFonts w:hint="eastAsia"/>
+        </w:rPr>
+        <w:t xml:space="preserve">B：USB</w:t>
+      </w:r>
+      <w:r>
+        <w:rPr>
+          <w:rStyle w:val="VerbatimChar"/>
+        </w:rPr>
+        <w:t xml:space="preserve"> </w:t>
+      </w:r>
+      <w:r>
+        <w:rPr>
+          <w:rStyle w:val="VerbatimChar"/>
+          <w:rFonts w:hint="eastAsia"/>
+        </w:rPr>
+        <w:t xml:space="preserve">讀取速度太慢，dirty</w:t>
+      </w:r>
+      <w:r>
+        <w:rPr>
+          <w:rStyle w:val="VerbatimChar"/>
+        </w:rPr>
+        <w:t xml:space="preserve"> pages </w:t>
+      </w:r>
+      <w:r>
+        <w:rPr>
+          <w:rStyle w:val="VerbatimChar"/>
+          <w:rFonts w:hint="eastAsia"/>
+        </w:rPr>
+        <w:t xml:space="preserve">從未堆積</w:t>
+      </w:r>
+      <w:r>
+        <w:br/>
+      </w:r>
+      <w:r>
+        <w:rPr>
+          <w:rStyle w:val="VerbatimChar"/>
+        </w:rPr>
+        <w:t xml:space="preserve">  USB → read() </w:t>
+      </w:r>
+      <w:r>
+        <w:rPr>
+          <w:rStyle w:val="VerbatimChar"/>
+          <w:rFonts w:hint="eastAsia"/>
+        </w:rPr>
+        <w:t xml:space="preserve">速度有限</w:t>
+      </w:r>
+      <w:r>
+        <w:br/>
+      </w:r>
+      <w:r>
+        <w:rPr>
+          <w:rStyle w:val="VerbatimChar"/>
+        </w:rPr>
+        <w:t xml:space="preserve">  → writeback </w:t>
+      </w:r>
+      <w:r>
+        <w:rPr>
+          <w:rStyle w:val="VerbatimChar"/>
+          <w:rFonts w:hint="eastAsia"/>
+        </w:rPr>
+        <w:t xml:space="preserve">總是跟得上</w:t>
+      </w:r>
+      <w:r>
+        <w:br/>
+      </w:r>
+      <w:r>
+        <w:rPr>
+          <w:rStyle w:val="VerbatimChar"/>
+        </w:rPr>
+        <w:t xml:space="preserve">  → dirty pages </w:t>
+      </w:r>
+      <w:r>
+        <w:rPr>
+          <w:rStyle w:val="VerbatimChar"/>
+          <w:rFonts w:hint="eastAsia"/>
+        </w:rPr>
+        <w:t xml:space="preserve">從未堆積到</w:t>
+      </w:r>
+      <w:r>
+        <w:rPr>
+          <w:rStyle w:val="VerbatimChar"/>
+        </w:rPr>
+        <w:t xml:space="preserve"> 1.2GB</w:t>
+      </w:r>
+      <w:r>
+        <w:br/>
+      </w:r>
+      <w:r>
+        <w:rPr>
+          <w:rStyle w:val="VerbatimChar"/>
+        </w:rPr>
+        <w:t xml:space="preserve">  → dirty_ratio mitigation </w:t>
+      </w:r>
+      <w:r>
+        <w:rPr>
+          <w:rStyle w:val="VerbatimChar"/>
+          <w:rFonts w:hint="eastAsia"/>
+        </w:rPr>
+        <w:t xml:space="preserve">效果有限</w:t>
+      </w:r>
+    </w:p>
+    <w:p>
+      <w:pPr>
+        <w:pStyle w:val="FirstParagraph"/>
+      </w:pPr>
+      <w:r>
+        <w:rPr>
+          <w:rFonts w:hint="eastAsia"/>
+          <w:b/>
+          <w:bCs/>
+        </w:rPr>
+        <w:t xml:space="preserve">需要用</w:t>
+      </w:r>
+      <w:r>
+        <w:rPr>
+          <w:b/>
+          <w:bCs/>
+        </w:rPr>
+        <w:t xml:space="preserve"> monitor.sh </w:t>
+      </w:r>
+      <w:r>
+        <w:rPr>
+          <w:rFonts w:hint="eastAsia"/>
+          <w:b/>
+          <w:bCs/>
+        </w:rPr>
+        <w:t xml:space="preserve">在複製過程中持續監控</w:t>
+      </w:r>
+      <w:r>
+        <w:rPr>
+          <w:b/>
+          <w:bCs/>
+        </w:rPr>
+        <w:t xml:space="preserve"> dirty pages </w:t>
+      </w:r>
+      <w:r>
+        <w:rPr>
+          <w:rFonts w:hint="eastAsia"/>
+          <w:b/>
+          <w:bCs/>
+        </w:rPr>
+        <w:t xml:space="preserve">峰值來驗證。</w:t>
+      </w:r>
+    </w:p>
+    <w:bookmarkEnd w:id="22"/>
+    <w:bookmarkStart w:id="23" w:name="修正後的因果鏈"/>
+    <w:p>
+      <w:pPr>
+        <w:pStyle w:val="Heading3"/>
+      </w:pPr>
+      <w:r>
+        <w:t xml:space="preserve">3.5 </w:t>
+      </w:r>
+      <w:r>
+        <w:rPr>
+          <w:rFonts w:hint="eastAsia"/>
+        </w:rPr>
+        <w:t xml:space="preserve">修正後的因果鏈</w:t>
+      </w:r>
+    </w:p>
+    <w:p>
+      <w:pPr>
+        <w:pStyle w:val="SourceCode"/>
+      </w:pPr>
+      <w:r>
+        <w:rPr>
+          <w:rStyle w:val="VerbatimChar"/>
+          <w:rFonts w:hint="eastAsia"/>
+        </w:rPr>
+        <w:t xml:space="preserve">確認的事實（從</w:t>
+      </w:r>
+      <w:r>
+        <w:rPr>
+          <w:rStyle w:val="VerbatimChar"/>
+        </w:rPr>
+        <w:t xml:space="preserve"> killinfo </w:t>
+      </w:r>
+      <w:r>
+        <w:rPr>
+          <w:rStyle w:val="VerbatimChar"/>
+          <w:rFonts w:hint="eastAsia"/>
+        </w:rPr>
+        <w:t xml:space="preserve">證實）：</w:t>
+      </w:r>
+      <w:r>
+        <w:br/>
+      </w:r>
+      <w:r>
+        <w:rPr>
+          <w:rStyle w:val="VerbatimChar"/>
+        </w:rPr>
+        <w:t xml:space="preserve">  - File pages </w:t>
+      </w:r>
+      <w:r>
+        <w:rPr>
+          <w:rStyle w:val="VerbatimChar"/>
+          <w:rFonts w:hint="eastAsia"/>
+        </w:rPr>
+        <w:t xml:space="preserve">從</w:t>
+      </w:r>
+      <w:r>
+        <w:rPr>
+          <w:rStyle w:val="VerbatimChar"/>
+        </w:rPr>
+        <w:t xml:space="preserve"> 3991 MB </w:t>
+      </w:r>
+      <w:r>
+        <w:rPr>
+          <w:rStyle w:val="VerbatimChar"/>
+          <w:rFonts w:hint="eastAsia"/>
+        </w:rPr>
+        <w:t xml:space="preserve">降到</w:t>
+      </w:r>
+      <w:r>
+        <w:rPr>
+          <w:rStyle w:val="VerbatimChar"/>
+        </w:rPr>
+        <w:t xml:space="preserve"> 388 </w:t>
+      </w:r>
+      <w:r>
+        <w:rPr>
+          <w:rStyle w:val="VerbatimChar"/>
+          <w:rFonts w:hint="eastAsia"/>
+        </w:rPr>
+        <w:t xml:space="preserve">MB（消失</w:t>
+      </w:r>
+      <w:r>
+        <w:rPr>
+          <w:rStyle w:val="VerbatimChar"/>
+        </w:rPr>
+        <w:t xml:space="preserve"> 3603 </w:t>
+      </w:r>
+      <w:r>
+        <w:rPr>
+          <w:rStyle w:val="VerbatimChar"/>
+          <w:rFonts w:hint="eastAsia"/>
+        </w:rPr>
+        <w:t xml:space="preserve">MB）</w:t>
+      </w:r>
+      <w:r>
+        <w:br/>
+      </w:r>
+      <w:r>
+        <w:rPr>
+          <w:rStyle w:val="VerbatimChar"/>
+        </w:rPr>
+        <w:t xml:space="preserve">  - Anonymous </w:t>
+      </w:r>
+      <w:r>
+        <w:rPr>
+          <w:rStyle w:val="VerbatimChar"/>
+          <w:rFonts w:hint="eastAsia"/>
+        </w:rPr>
+        <w:t xml:space="preserve">沒有膨脹（反而減少</w:t>
+      </w:r>
+      <w:r>
+        <w:rPr>
+          <w:rStyle w:val="VerbatimChar"/>
+        </w:rPr>
+        <w:t xml:space="preserve"> 279 </w:t>
+      </w:r>
+      <w:r>
+        <w:rPr>
+          <w:rStyle w:val="VerbatimChar"/>
+          <w:rFonts w:hint="eastAsia"/>
+        </w:rPr>
+        <w:t xml:space="preserve">MB）</w:t>
+      </w:r>
+      <w:r>
+        <w:br/>
+      </w:r>
+      <w:r>
+        <w:rPr>
+          <w:rStyle w:val="VerbatimChar"/>
+        </w:rPr>
+        <w:t xml:space="preserve">  - FBG RSS = 681 </w:t>
+      </w:r>
+      <w:r>
+        <w:rPr>
+          <w:rStyle w:val="VerbatimChar"/>
+          <w:rFonts w:hint="eastAsia"/>
+        </w:rPr>
+        <w:t xml:space="preserve">MB（不是</w:t>
+      </w:r>
+      <w:r>
+        <w:rPr>
+          <w:rStyle w:val="VerbatimChar"/>
+        </w:rPr>
+        <w:t xml:space="preserve"> </w:t>
+      </w:r>
+      <w:r>
+        <w:rPr>
+          <w:rStyle w:val="VerbatimChar"/>
+          <w:rFonts w:hint="eastAsia"/>
+        </w:rPr>
+        <w:t xml:space="preserve">2.5GB）</w:t>
+      </w:r>
+      <w:r>
+        <w:br/>
+      </w:r>
+      <w:r>
+        <w:rPr>
+          <w:rStyle w:val="VerbatimChar"/>
+        </w:rPr>
+        <w:t xml:space="preserve">  - thrashing% </w:t>
+      </w:r>
+      <w:r>
+        <w:rPr>
+          <w:rStyle w:val="VerbatimChar"/>
+          <w:rFonts w:hint="eastAsia"/>
+        </w:rPr>
+        <w:t xml:space="preserve">從頭到尾</w:t>
+      </w:r>
+      <w:r>
+        <w:rPr>
+          <w:rStyle w:val="VerbatimChar"/>
+        </w:rPr>
+        <w:t xml:space="preserve"> &gt; 1200%</w:t>
+      </w:r>
+      <w:r>
+        <w:br/>
+      </w:r>
+      <w:r>
+        <w:rPr>
+          <w:rStyle w:val="VerbatimChar"/>
+        </w:rPr>
+        <w:t xml:space="preserve">  - SwapFree </w:t>
+      </w:r>
+      <w:r>
+        <w:rPr>
+          <w:rStyle w:val="VerbatimChar"/>
+          <w:rFonts w:hint="eastAsia"/>
+        </w:rPr>
+        <w:t xml:space="preserve">始終</w:t>
+      </w:r>
+      <w:r>
+        <w:rPr>
+          <w:rStyle w:val="VerbatimChar"/>
+        </w:rPr>
+        <w:t xml:space="preserve"> &gt; 3.3 GB</w:t>
+      </w:r>
+      <w:r>
+        <w:br/>
+      </w:r>
+      <w:r>
+        <w:br/>
+      </w:r>
+      <w:r>
+        <w:rPr>
+          <w:rStyle w:val="VerbatimChar"/>
+          <w:rFonts w:hint="eastAsia"/>
+        </w:rPr>
+        <w:t xml:space="preserve">因果鏈：</w:t>
+      </w:r>
+      <w:r>
+        <w:br/>
+      </w:r>
+      <w:r>
+        <w:rPr>
+          <w:rStyle w:val="VerbatimChar"/>
+        </w:rPr>
+        <w:t xml:space="preserve">  </w:t>
+      </w:r>
+      <w:r>
+        <w:rPr>
+          <w:rStyle w:val="VerbatimChar"/>
+          <w:rFonts w:hint="eastAsia"/>
+        </w:rPr>
+        <w:t xml:space="preserve">大量</w:t>
+      </w:r>
+      <w:r>
+        <w:rPr>
+          <w:rStyle w:val="VerbatimChar"/>
+        </w:rPr>
+        <w:t xml:space="preserve"> </w:t>
+      </w:r>
+      <w:r>
+        <w:rPr>
+          <w:rStyle w:val="VerbatimChar"/>
+          <w:rFonts w:hint="eastAsia"/>
+        </w:rPr>
+        <w:t xml:space="preserve">I/O（USB</w:t>
+      </w:r>
+      <w:r>
+        <w:rPr>
+          <w:rStyle w:val="VerbatimChar"/>
+        </w:rPr>
+        <w:t xml:space="preserve"> → Internal </w:t>
+      </w:r>
+      <w:r>
+        <w:rPr>
+          <w:rStyle w:val="VerbatimChar"/>
+          <w:rFonts w:hint="eastAsia"/>
+        </w:rPr>
+        <w:t xml:space="preserve">Storage）</w:t>
+      </w:r>
+      <w:r>
+        <w:br/>
+      </w:r>
+      <w:r>
+        <w:rPr>
+          <w:rStyle w:val="VerbatimChar"/>
+        </w:rPr>
+        <w:t xml:space="preserve">  → kswapd </w:t>
+      </w:r>
+      <w:r>
+        <w:rPr>
+          <w:rStyle w:val="VerbatimChar"/>
+          <w:rFonts w:hint="eastAsia"/>
+        </w:rPr>
+        <w:t xml:space="preserve">大量回收</w:t>
+      </w:r>
+      <w:r>
+        <w:rPr>
+          <w:rStyle w:val="VerbatimChar"/>
+        </w:rPr>
+        <w:t xml:space="preserve"> file </w:t>
+      </w:r>
+      <w:r>
+        <w:rPr>
+          <w:rStyle w:val="VerbatimChar"/>
+          <w:rFonts w:hint="eastAsia"/>
+        </w:rPr>
+        <w:t xml:space="preserve">cache（原因待驗證：dirty</w:t>
+      </w:r>
+      <w:r>
+        <w:rPr>
+          <w:rStyle w:val="VerbatimChar"/>
+        </w:rPr>
+        <w:t xml:space="preserve"> pages </w:t>
+      </w:r>
+      <w:r>
+        <w:rPr>
+          <w:rStyle w:val="VerbatimChar"/>
+          <w:rFonts w:hint="eastAsia"/>
+        </w:rPr>
+        <w:t xml:space="preserve">或其他壓力源）</w:t>
+      </w:r>
+      <w:r>
+        <w:br/>
+      </w:r>
+      <w:r>
+        <w:rPr>
+          <w:rStyle w:val="VerbatimChar"/>
+        </w:rPr>
+        <w:t xml:space="preserve">  → file cache </w:t>
+      </w:r>
+      <w:r>
+        <w:rPr>
+          <w:rStyle w:val="VerbatimChar"/>
+          <w:rFonts w:hint="eastAsia"/>
+        </w:rPr>
+        <w:t xml:space="preserve">從</w:t>
+      </w:r>
+      <w:r>
+        <w:rPr>
+          <w:rStyle w:val="VerbatimChar"/>
+        </w:rPr>
+        <w:t xml:space="preserve"> 3991 MB </w:t>
+      </w:r>
+      <w:r>
+        <w:rPr>
+          <w:rStyle w:val="VerbatimChar"/>
+          <w:rFonts w:hint="eastAsia"/>
+        </w:rPr>
+        <w:t xml:space="preserve">被回收到</w:t>
+      </w:r>
+      <w:r>
+        <w:rPr>
+          <w:rStyle w:val="VerbatimChar"/>
+        </w:rPr>
+        <w:t xml:space="preserve"> 388 MB</w:t>
+      </w:r>
+      <w:r>
+        <w:br/>
+      </w:r>
+      <w:r>
+        <w:rPr>
+          <w:rStyle w:val="VerbatimChar"/>
+        </w:rPr>
+        <w:t xml:space="preserve">  → </w:t>
+      </w:r>
+      <w:r>
+        <w:rPr>
+          <w:rStyle w:val="VerbatimChar"/>
+          <w:rFonts w:hint="eastAsia"/>
+        </w:rPr>
+        <w:t xml:space="preserve">剩餘的</w:t>
+      </w:r>
+      <w:r>
+        <w:rPr>
+          <w:rStyle w:val="VerbatimChar"/>
+        </w:rPr>
+        <w:t xml:space="preserve"> 388 MB </w:t>
+      </w:r>
+      <w:r>
+        <w:rPr>
+          <w:rStyle w:val="VerbatimChar"/>
+          <w:rFonts w:hint="eastAsia"/>
+        </w:rPr>
+        <w:t xml:space="preserve">是</w:t>
+      </w:r>
+      <w:r>
+        <w:rPr>
+          <w:rStyle w:val="VerbatimChar"/>
+        </w:rPr>
+        <w:t xml:space="preserve"> FBG </w:t>
+      </w:r>
+      <w:r>
+        <w:rPr>
+          <w:rStyle w:val="VerbatimChar"/>
+          <w:rFonts w:hint="eastAsia"/>
+        </w:rPr>
+        <w:t xml:space="preserve">的</w:t>
+      </w:r>
+      <w:r>
+        <w:rPr>
+          <w:rStyle w:val="VerbatimChar"/>
+        </w:rPr>
+        <w:t xml:space="preserve"> working set</w:t>
+      </w:r>
+      <w:r>
+        <w:br/>
+      </w:r>
+      <w:r>
+        <w:rPr>
+          <w:rStyle w:val="VerbatimChar"/>
+        </w:rPr>
+        <w:t xml:space="preserve">  → kswapd </w:t>
+      </w:r>
+      <w:r>
+        <w:rPr>
+          <w:rStyle w:val="VerbatimChar"/>
+          <w:rFonts w:hint="eastAsia"/>
+        </w:rPr>
+        <w:t xml:space="preserve">回收它們</w:t>
+      </w:r>
+      <w:r>
+        <w:rPr>
+          <w:rStyle w:val="VerbatimChar"/>
+        </w:rPr>
+        <w:t xml:space="preserve"> → </w:t>
+      </w:r>
+      <w:r>
+        <w:rPr>
+          <w:rStyle w:val="VerbatimChar"/>
+          <w:rFonts w:hint="eastAsia"/>
+        </w:rPr>
+        <w:t xml:space="preserve">立刻</w:t>
+      </w:r>
+      <w:r>
+        <w:rPr>
+          <w:rStyle w:val="VerbatimChar"/>
+        </w:rPr>
+        <w:t xml:space="preserve"> refault → thrashing</w:t>
+      </w:r>
+      <w:r>
+        <w:br/>
+      </w:r>
+      <w:r>
+        <w:rPr>
+          <w:rStyle w:val="VerbatimChar"/>
+        </w:rPr>
+        <w:t xml:space="preserve">  → thrashing% &gt; 300% → PSI CRITICAL → min_oom_score=0</w:t>
+      </w:r>
+      <w:r>
+        <w:br/>
+      </w:r>
+      <w:r>
+        <w:rPr>
+          <w:rStyle w:val="VerbatimChar"/>
+        </w:rPr>
+        <w:t xml:space="preserve">  → lmkd kill Files by </w:t>
+      </w:r>
+      <w:r>
+        <w:rPr>
+          <w:rStyle w:val="VerbatimChar"/>
+          <w:rFonts w:hint="eastAsia"/>
+        </w:rPr>
+        <w:t xml:space="preserve">Google（tasksize</w:t>
+      </w:r>
+      <w:r>
+        <w:rPr>
+          <w:rStyle w:val="VerbatimChar"/>
+        </w:rPr>
+        <w:t xml:space="preserve"> 681 </w:t>
+      </w:r>
+      <w:r>
+        <w:rPr>
+          <w:rStyle w:val="VerbatimChar"/>
+          <w:rFonts w:hint="eastAsia"/>
+        </w:rPr>
+        <w:t xml:space="preserve">MB，前台最大的</w:t>
+      </w:r>
+      <w:r>
+        <w:rPr>
+          <w:rStyle w:val="VerbatimChar"/>
+        </w:rPr>
+        <w:t xml:space="preserve"> </w:t>
+      </w:r>
+      <w:r>
+        <w:rPr>
+          <w:rStyle w:val="VerbatimChar"/>
+          <w:rFonts w:hint="eastAsia"/>
+        </w:rPr>
+        <w:t xml:space="preserve">process）</w:t>
+      </w:r>
+    </w:p>
+    <w:bookmarkEnd w:id="23"/>
+    <w:bookmarkStart w:id="24" w:name="kswapd-回收活動證據"/>
     <w:p>
       <w:pPr>
         <w:pStyle w:val="Heading3"/>
@@ -5267,8 +6117,8 @@
         <w:t xml:space="preserve"> 24%。</w:t>
       </w:r>
     </w:p>
-    <w:bookmarkEnd w:id="22"/>
-    <w:bookmarkStart w:id="23" w:name="kill-過程中的記憶體追蹤"/>
+    <w:bookmarkEnd w:id="24"/>
+    <w:bookmarkStart w:id="25" w:name="kill-過程中的記憶體追蹤"/>
     <w:p>
       <w:pPr>
         <w:pStyle w:val="Heading3"/>
@@ -5524,9 +6374,9 @@
         </w:pict>
       </w:r>
     </w:p>
-    <w:bookmarkEnd w:id="23"/>
-    <w:bookmarkEnd w:id="24"/>
-    <w:bookmarkStart w:id="32" w:name="修正後的-mitigation-plan"/>
+    <w:bookmarkEnd w:id="25"/>
+    <w:bookmarkEnd w:id="26"/>
+    <w:bookmarkStart w:id="34" w:name="修正後的-mitigation-plan"/>
     <w:p>
       <w:pPr>
         <w:pStyle w:val="Heading2"/>
@@ -5544,7 +6394,7 @@
         <w:t xml:space="preserve"> Mitigation Plan</w:t>
       </w:r>
     </w:p>
-    <w:bookmarkStart w:id="25" w:name="核心策略"/>
+    <w:bookmarkStart w:id="27" w:name="核心策略"/>
     <w:p>
       <w:pPr>
         <w:pStyle w:val="Heading3"/>
@@ -5620,7 +6470,7 @@
           <w:rStyle w:val="VerbatimChar"/>
           <w:rFonts w:hint="eastAsia"/>
         </w:rPr>
-        <w:t xml:space="preserve">不被擠壓</w:t>
+        <w:t xml:space="preserve">不被擠壓（待驗證效果）</w:t>
       </w:r>
       <w:r>
         <w:br/>
@@ -5656,7 +6506,20 @@
           <w:rStyle w:val="VerbatimChar"/>
           <w:rFonts w:hint="eastAsia"/>
         </w:rPr>
-        <w:t xml:space="preserve">減少對</w:t>
+        <w:t xml:space="preserve">減少</w:t>
+      </w:r>
+      <w:r>
+        <w:rPr>
+          <w:rStyle w:val="VerbatimChar"/>
+        </w:rPr>
+        <w:t xml:space="preserve"> kswapd </w:t>
+      </w:r>
+      <w:r>
+        <w:rPr>
+          <w:rStyle w:val="VerbatimChar"/>
+          <w:rFonts w:hint="eastAsia"/>
+        </w:rPr>
+        <w:t xml:space="preserve">對</w:t>
       </w:r>
       <w:r>
         <w:rPr>
@@ -5672,8 +6535,8 @@
         <w:t xml:space="preserve">的回收壓力</w:t>
       </w:r>
     </w:p>
-    <w:bookmarkEnd w:id="25"/>
-    <w:bookmarkStart w:id="26" w:name="方向-1限制-dirty-page-cache核心措施"/>
+    <w:bookmarkEnd w:id="27"/>
+    <w:bookmarkStart w:id="28" w:name="方向-1限制-dirty-page-cache"/>
     <w:p>
       <w:pPr>
         <w:pStyle w:val="Heading3"/>
@@ -5697,13 +6560,7 @@
         <w:t xml:space="preserve">1：限制</w:t>
       </w:r>
       <w:r>
-        <w:t xml:space="preserve"> Dirty Page </w:t>
-      </w:r>
-      <w:r>
-        <w:rPr>
-          <w:rFonts w:hint="eastAsia"/>
-        </w:rPr>
-        <w:t xml:space="preserve">Cache（核心措施）</w:t>
+        <w:t xml:space="preserve"> Dirty Page Cache</w:t>
       </w:r>
     </w:p>
     <w:tbl>
@@ -5838,16 +6695,7 @@
               <w:t xml:space="preserve">上限</w:t>
             </w:r>
             <w:r>
-              <w:t xml:space="preserve"> 1.2GB → </w:t>
-            </w:r>
-            <w:r>
-              <w:rPr>
-                <w:rFonts w:hint="eastAsia"/>
-              </w:rPr>
-              <w:t xml:space="preserve">300MB，省出</w:t>
-            </w:r>
-            <w:r>
-              <w:t xml:space="preserve"> 900MB</w:t>
+              <w:t xml:space="preserve"> 1.2GB → 300MB</w:t>
             </w:r>
           </w:p>
         </w:tc>
@@ -5994,8 +6842,88 @@
       <w:r>
         <w:rPr>
           <w:rFonts w:hint="eastAsia"/>
-        </w:rPr>
-        <w:t xml:space="preserve">運作原理：</w:t>
+          <w:b/>
+          <w:bCs/>
+        </w:rPr>
+        <w:t xml:space="preserve">效果待驗證</w:t>
+      </w:r>
+      <w:r>
+        <w:rPr>
+          <w:rFonts w:hint="eastAsia"/>
+        </w:rPr>
+        <w:t xml:space="preserve">：killinfo</w:t>
+      </w:r>
+      <w:r>
+        <w:t xml:space="preserve"> </w:t>
+      </w:r>
+      <w:r>
+        <w:rPr>
+          <w:rFonts w:hint="eastAsia"/>
+        </w:rPr>
+        <w:t xml:space="preserve">中</w:t>
+      </w:r>
+      <w:r>
+        <w:t xml:space="preserve"> dirty pages </w:t>
+      </w:r>
+      <w:r>
+        <w:rPr>
+          <w:rFonts w:hint="eastAsia"/>
+        </w:rPr>
+        <w:t xml:space="preserve">接近</w:t>
+      </w:r>
+      <w:r>
+        <w:t xml:space="preserve"> </w:t>
+      </w:r>
+      <w:r>
+        <w:rPr>
+          <w:rFonts w:hint="eastAsia"/>
+        </w:rPr>
+        <w:t xml:space="preserve">0（kill</w:t>
+      </w:r>
+      <w:r>
+        <w:t xml:space="preserve"> </w:t>
+      </w:r>
+      <w:r>
+        <w:rPr>
+          <w:rFonts w:hint="eastAsia"/>
+        </w:rPr>
+        <w:t xml:space="preserve">瞬間快照），無法確認複製過程中的</w:t>
+      </w:r>
+      <w:r>
+        <w:t xml:space="preserve"> dirty pages </w:t>
+      </w:r>
+      <w:r>
+        <w:rPr>
+          <w:rFonts w:hint="eastAsia"/>
+        </w:rPr>
+        <w:t xml:space="preserve">峰值。需要用</w:t>
+      </w:r>
+      <w:r>
+        <w:t xml:space="preserve"> monitor.sh </w:t>
+      </w:r>
+      <w:r>
+        <w:rPr>
+          <w:rFonts w:hint="eastAsia"/>
+        </w:rPr>
+        <w:t xml:space="preserve">在</w:t>
+      </w:r>
+      <w:r>
+        <w:t xml:space="preserve"> USB → Internal </w:t>
+      </w:r>
+      <w:r>
+        <w:rPr>
+          <w:rFonts w:hint="eastAsia"/>
+        </w:rPr>
+        <w:t xml:space="preserve">複製過程中持續監控</w:t>
+      </w:r>
+      <w:r>
+        <w:t xml:space="preserve"> dirty pages </w:t>
+      </w:r>
+      <w:r>
+        <w:rPr>
+          <w:rFonts w:hint="eastAsia"/>
+        </w:rPr>
+        <w:t xml:space="preserve">來判斷此措施是否有效。</w:t>
       </w:r>
     </w:p>
     <w:p>
@@ -6007,128 +6935,69 @@
           <w:rStyle w:val="VerbatimChar"/>
           <w:rFonts w:hint="eastAsia"/>
         </w:rPr>
-        <w:t xml:space="preserve">修改前</w:t>
-      </w:r>
-      <w:r>
-        <w:rPr>
-          <w:rStyle w:val="VerbatimChar"/>
-        </w:rPr>
-        <w:t xml:space="preserve"> (dirty_ratio=20):</w:t>
-      </w:r>
-      <w:r>
-        <w:br/>
-      </w:r>
-      <w:r>
-        <w:rPr>
-          <w:rStyle w:val="VerbatimChar"/>
-        </w:rPr>
-        <w:t xml:space="preserve">  write() → dirty </w:t>
-      </w:r>
-      <w:r>
-        <w:rPr>
-          <w:rStyle w:val="VerbatimChar"/>
-          <w:rFonts w:hint="eastAsia"/>
-        </w:rPr>
-        <w:t xml:space="preserve">堆到</w:t>
-      </w:r>
-      <w:r>
-        <w:rPr>
-          <w:rStyle w:val="VerbatimChar"/>
-        </w:rPr>
-        <w:t xml:space="preserve"> 1.2GB → kswapd </w:t>
-      </w:r>
-      <w:r>
-        <w:rPr>
-          <w:rStyle w:val="VerbatimChar"/>
-          <w:rFonts w:hint="eastAsia"/>
-        </w:rPr>
-        <w:t xml:space="preserve">回收</w:t>
-      </w:r>
-      <w:r>
-        <w:rPr>
-          <w:rStyle w:val="VerbatimChar"/>
-        </w:rPr>
-        <w:t xml:space="preserve"> file cache → 388MB → thrashing → crash</w:t>
-      </w:r>
-      <w:r>
-        <w:br/>
-      </w:r>
-      <w:r>
-        <w:br/>
-      </w:r>
-      <w:r>
-        <w:rPr>
-          <w:rStyle w:val="VerbatimChar"/>
-          <w:rFonts w:hint="eastAsia"/>
-        </w:rPr>
-        <w:t xml:space="preserve">修改後</w:t>
-      </w:r>
-      <w:r>
-        <w:rPr>
-          <w:rStyle w:val="VerbatimChar"/>
-        </w:rPr>
-        <w:t xml:space="preserve"> (dirty_ratio=5):</w:t>
-      </w:r>
-      <w:r>
-        <w:br/>
-      </w:r>
-      <w:r>
-        <w:rPr>
-          <w:rStyle w:val="VerbatimChar"/>
-        </w:rPr>
-        <w:t xml:space="preserve">  write() → dirty </w:t>
-      </w:r>
-      <w:r>
-        <w:rPr>
-          <w:rStyle w:val="VerbatimChar"/>
-          <w:rFonts w:hint="eastAsia"/>
-        </w:rPr>
-        <w:t xml:space="preserve">到</w:t>
-      </w:r>
-      <w:r>
-        <w:rPr>
-          <w:rStyle w:val="VerbatimChar"/>
-        </w:rPr>
-        <w:t xml:space="preserve"> 300MB </w:t>
-      </w:r>
-      <w:r>
-        <w:rPr>
-          <w:rStyle w:val="VerbatimChar"/>
-          <w:rFonts w:hint="eastAsia"/>
-        </w:rPr>
-        <w:t xml:space="preserve">就阻塞</w:t>
-      </w:r>
-      <w:r>
-        <w:rPr>
-          <w:rStyle w:val="VerbatimChar"/>
-        </w:rPr>
-        <w:t xml:space="preserve"> → file cache </w:t>
-      </w:r>
-      <w:r>
-        <w:rPr>
-          <w:rStyle w:val="VerbatimChar"/>
-          <w:rFonts w:hint="eastAsia"/>
-        </w:rPr>
-        <w:t xml:space="preserve">維持</w:t>
-      </w:r>
-      <w:r>
-        <w:rPr>
-          <w:rStyle w:val="VerbatimChar"/>
-        </w:rPr>
-        <w:t xml:space="preserve"> ~1288MB → </w:t>
-      </w:r>
-      <w:r>
-        <w:rPr>
-          <w:rStyle w:val="VerbatimChar"/>
-          <w:rFonts w:hint="eastAsia"/>
-        </w:rPr>
-        <w:t xml:space="preserve">不</w:t>
-      </w:r>
-      <w:r>
-        <w:rPr>
-          <w:rStyle w:val="VerbatimChar"/>
-        </w:rPr>
-        <w:t xml:space="preserve"> thrashing</w:t>
+        <w:t xml:space="preserve">如果複製中</w:t>
+      </w:r>
+      <w:r>
+        <w:rPr>
+          <w:rStyle w:val="VerbatimChar"/>
+        </w:rPr>
+        <w:t xml:space="preserve"> dirty peaks &gt; 300 MB → dirty_ratio=5 </w:t>
+      </w:r>
+      <w:r>
+        <w:rPr>
+          <w:rStyle w:val="VerbatimChar"/>
+          <w:rFonts w:hint="eastAsia"/>
+        </w:rPr>
+        <w:t xml:space="preserve">有效（限制堆積）</w:t>
+      </w:r>
+      <w:r>
+        <w:br/>
+      </w:r>
+      <w:r>
+        <w:rPr>
+          <w:rStyle w:val="VerbatimChar"/>
+          <w:rFonts w:hint="eastAsia"/>
+        </w:rPr>
+        <w:t xml:space="preserve">如果複製中</w:t>
+      </w:r>
+      <w:r>
+        <w:rPr>
+          <w:rStyle w:val="VerbatimChar"/>
+        </w:rPr>
+        <w:t xml:space="preserve"> dirty peaks &lt; 300 MB → dirty_ratio=5 </w:t>
+      </w:r>
+      <w:r>
+        <w:rPr>
+          <w:rStyle w:val="VerbatimChar"/>
+          <w:rFonts w:hint="eastAsia"/>
+        </w:rPr>
+        <w:t xml:space="preserve">效果有限（USB</w:t>
+      </w:r>
+      <w:r>
+        <w:rPr>
+          <w:rStyle w:val="VerbatimChar"/>
+        </w:rPr>
+        <w:t xml:space="preserve"> </w:t>
+      </w:r>
+      <w:r>
+        <w:rPr>
+          <w:rStyle w:val="VerbatimChar"/>
+          <w:rFonts w:hint="eastAsia"/>
+        </w:rPr>
+        <w:t xml:space="preserve">太慢，dirty</w:t>
+      </w:r>
+      <w:r>
+        <w:rPr>
+          <w:rStyle w:val="VerbatimChar"/>
+        </w:rPr>
+        <w:t xml:space="preserve"> </w:t>
+      </w:r>
+      <w:r>
+        <w:rPr>
+          <w:rStyle w:val="VerbatimChar"/>
+          <w:rFonts w:hint="eastAsia"/>
+        </w:rPr>
+        <w:t xml:space="preserve">來不及堆積）</w:t>
       </w:r>
     </w:p>
     <w:p>
@@ -6139,7 +7008,7 @@
         <w:rPr>
           <w:rFonts w:hint="eastAsia"/>
         </w:rPr>
-        <w:t xml:space="preserve">驗證結果：✓</w:t>
+        <w:t xml:space="preserve">驗證狀態：⚠</w:t>
       </w:r>
       <w:r>
         <w:t xml:space="preserve"> </w:t>
@@ -6148,10 +7017,10 @@
         <w:rPr>
           <w:rFonts w:hint="eastAsia"/>
         </w:rPr>
-        <w:t xml:space="preserve">已在</w:t>
-      </w:r>
-      <w:r>
-        <w:t xml:space="preserve"> T70 (DBB260100011) </w:t>
+        <w:t xml:space="preserve">參數已在</w:t>
+      </w:r>
+      <w:r>
+        <w:t xml:space="preserve"> T70 </w:t>
       </w:r>
       <w:r>
         <w:rPr>
@@ -6166,11 +7035,20 @@
         <w:rPr>
           <w:rFonts w:hint="eastAsia"/>
         </w:rPr>
-        <w:t xml:space="preserve">測試成功。</w:t>
+        <w:t xml:space="preserve">測試可套用，但實際效果待</w:t>
+      </w:r>
+      <w:r>
+        <w:t xml:space="preserve"> monitor.sh </w:t>
+      </w:r>
+      <w:r>
+        <w:rPr>
+          <w:rFonts w:hint="eastAsia"/>
+        </w:rPr>
+        <w:t xml:space="preserve">數據驗證。</w:t>
       </w:r>
     </w:p>
-    <w:bookmarkEnd w:id="26"/>
-    <w:bookmarkStart w:id="27" w:name="方向-2提早清除-cached-apps輔助措施"/>
+    <w:bookmarkEnd w:id="28"/>
+    <w:bookmarkStart w:id="29" w:name="方向-2提早清除-cached-apps輔助措施"/>
     <w:p>
       <w:pPr>
         <w:pStyle w:val="Heading3"/>
@@ -6584,8 +7462,8 @@
         <w:t xml:space="preserve"> file cache</w:t>
       </w:r>
     </w:p>
-    <w:bookmarkEnd w:id="27"/>
-    <w:bookmarkStart w:id="28" w:name="預期效果"/>
+    <w:bookmarkEnd w:id="29"/>
+    <w:bookmarkStart w:id="30" w:name="預期效果"/>
     <w:p>
       <w:pPr>
         <w:pStyle w:val="Heading3"/>
@@ -6674,8 +7552,8 @@
         <w:t xml:space="preserve"> working set</w:t>
       </w:r>
     </w:p>
-    <w:bookmarkEnd w:id="28"/>
-    <w:bookmarkStart w:id="29" w:name="實現方式"/>
+    <w:bookmarkEnd w:id="30"/>
+    <w:bookmarkStart w:id="31" w:name="實現方式"/>
     <w:p>
       <w:pPr>
         <w:pStyle w:val="Heading3"/>
@@ -6821,8 +7699,8 @@
         <w:t xml:space="preserve">sys.sysctl.extra_free_kbytes=54674</w:t>
       </w:r>
     </w:p>
-    <w:bookmarkEnd w:id="29"/>
-    <w:bookmarkStart w:id="30" w:name="評估後排除的方案"/>
+    <w:bookmarkEnd w:id="31"/>
+    <w:bookmarkStart w:id="32" w:name="評估後排除的方案"/>
     <w:p>
       <w:pPr>
         <w:pStyle w:val="Heading3"/>
@@ -7034,8 +7912,8 @@
         </w:tc>
       </w:tr>
     </w:tbl>
-    <w:bookmarkEnd w:id="30"/>
-    <w:bookmarkStart w:id="31" w:name="風險評估"/>
+    <w:bookmarkEnd w:id="32"/>
+    <w:bookmarkStart w:id="33" w:name="風險評估"/>
     <w:p>
       <w:pPr>
         <w:pStyle w:val="Heading3"/>
@@ -7313,9 +8191,9 @@
         </w:pict>
       </w:r>
     </w:p>
-    <w:bookmarkEnd w:id="31"/>
-    <w:bookmarkEnd w:id="32"/>
-    <w:bookmarkStart w:id="33" w:name="oom-reaper-說明"/>
+    <w:bookmarkEnd w:id="33"/>
+    <w:bookmarkEnd w:id="34"/>
+    <w:bookmarkStart w:id="35" w:name="oom-reaper-說明"/>
     <w:p>
       <w:pPr>
         <w:pStyle w:val="Heading2"/>
@@ -7619,8 +8497,8 @@
         </w:pict>
       </w:r>
     </w:p>
-    <w:bookmarkEnd w:id="33"/>
-    <w:bookmarkStart w:id="34" w:name="測試工具"/>
+    <w:bookmarkEnd w:id="35"/>
+    <w:bookmarkStart w:id="36" w:name="測試工具"/>
     <w:p>
       <w:pPr>
         <w:pStyle w:val="Heading2"/>
@@ -7673,8 +8551,8 @@
         </w:pict>
       </w:r>
     </w:p>
-    <w:bookmarkEnd w:id="34"/>
-    <w:bookmarkStart w:id="35" w:name="附件"/>
+    <w:bookmarkEnd w:id="36"/>
+    <w:bookmarkStart w:id="37" w:name="附件"/>
     <w:p>
       <w:pPr>
         <w:pStyle w:val="Heading2"/>
@@ -7767,8 +8645,8 @@
         <w:t xml:space="preserve">裝置端監控腳本</w:t>
       </w:r>
     </w:p>
-    <w:bookmarkEnd w:id="35"/>
-    <w:bookmarkEnd w:id="36"/>
+    <w:bookmarkEnd w:id="37"/>
+    <w:bookmarkEnd w:id="38"/>
     <w:sectPr>
       <w:footnotePr>
         <w:numRestart w:val="eachSect"/>
@@ -8656,7 +9534,6 @@
     <w:link w:val="VerbatimChar"/>
     <w:pPr>
       <w:wordWrap w:val="off"/>
-      <w:shd w:val="clear" w:fill="f8f8f8"/>
     </w:pPr>
   </w:style>
   <w:style w:type="character" w:customStyle="1" w:styleId="KeywordTok">
@@ -8664,96 +9541,85 @@
     <w:basedOn w:val="VerbatimChar"/>
     <w:rPr>
       <w:b/>
-      <w:color w:val="204a87"/>
-      <w:shd w:val="clear" w:fill="f8f8f8"/>
+      <w:color w:val="007020"/>
     </w:rPr>
   </w:style>
   <w:style w:type="character" w:customStyle="1" w:styleId="DataTypeTok">
     <w:name w:val="DataTypeTok"/>
     <w:basedOn w:val="VerbatimChar"/>
     <w:rPr>
-      <w:color w:val="204a87"/>
-      <w:shd w:val="clear" w:fill="f8f8f8"/>
+      <w:color w:val="902000"/>
     </w:rPr>
   </w:style>
   <w:style w:type="character" w:customStyle="1" w:styleId="DecValTok">
     <w:name w:val="DecValTok"/>
     <w:basedOn w:val="VerbatimChar"/>
     <w:rPr>
-      <w:color w:val="0000cf"/>
-      <w:shd w:val="clear" w:fill="f8f8f8"/>
+      <w:color w:val="40a070"/>
     </w:rPr>
   </w:style>
   <w:style w:type="character" w:customStyle="1" w:styleId="BaseNTok">
     <w:name w:val="BaseNTok"/>
     <w:basedOn w:val="VerbatimChar"/>
     <w:rPr>
-      <w:color w:val="0000cf"/>
-      <w:shd w:val="clear" w:fill="f8f8f8"/>
+      <w:color w:val="40a070"/>
     </w:rPr>
   </w:style>
   <w:style w:type="character" w:customStyle="1" w:styleId="FloatTok">
     <w:name w:val="FloatTok"/>
     <w:basedOn w:val="VerbatimChar"/>
     <w:rPr>
-      <w:color w:val="0000cf"/>
-      <w:shd w:val="clear" w:fill="f8f8f8"/>
+      <w:color w:val="40a070"/>
     </w:rPr>
   </w:style>
   <w:style w:type="character" w:customStyle="1" w:styleId="ConstantTok">
     <w:name w:val="ConstantTok"/>
     <w:basedOn w:val="VerbatimChar"/>
     <w:rPr>
-      <w:color w:val="8f5902"/>
-      <w:shd w:val="clear" w:fill="f8f8f8"/>
+      <w:color w:val="880000"/>
     </w:rPr>
   </w:style>
   <w:style w:type="character" w:customStyle="1" w:styleId="CharTok">
     <w:name w:val="CharTok"/>
     <w:basedOn w:val="VerbatimChar"/>
     <w:rPr>
-      <w:color w:val="4e9a06"/>
-      <w:shd w:val="clear" w:fill="f8f8f8"/>
+      <w:color w:val="4070a0"/>
     </w:rPr>
   </w:style>
   <w:style w:type="character" w:customStyle="1" w:styleId="SpecialCharTok">
     <w:name w:val="SpecialCharTok"/>
     <w:basedOn w:val="VerbatimChar"/>
     <w:rPr>
-      <w:b/>
-      <w:color w:val="ce5c00"/>
-      <w:shd w:val="clear" w:fill="f8f8f8"/>
+      <w:color w:val="4070a0"/>
     </w:rPr>
   </w:style>
   <w:style w:type="character" w:customStyle="1" w:styleId="StringTok">
     <w:name w:val="StringTok"/>
     <w:basedOn w:val="VerbatimChar"/>
     <w:rPr>
-      <w:color w:val="4e9a06"/>
-      <w:shd w:val="clear" w:fill="f8f8f8"/>
+      <w:color w:val="4070a0"/>
     </w:rPr>
   </w:style>
   <w:style w:type="character" w:customStyle="1" w:styleId="VerbatimStringTok">
     <w:name w:val="VerbatimStringTok"/>
     <w:basedOn w:val="VerbatimChar"/>
     <w:rPr>
-      <w:color w:val="4e9a06"/>
-      <w:shd w:val="clear" w:fill="f8f8f8"/>
+      <w:color w:val="4070a0"/>
     </w:rPr>
   </w:style>
   <w:style w:type="character" w:customStyle="1" w:styleId="SpecialStringTok">
     <w:name w:val="SpecialStringTok"/>
     <w:basedOn w:val="VerbatimChar"/>
     <w:rPr>
-      <w:color w:val="4e9a06"/>
-      <w:shd w:val="clear" w:fill="f8f8f8"/>
+      <w:color w:val="bb6688"/>
     </w:rPr>
   </w:style>
   <w:style w:type="character" w:customStyle="1" w:styleId="ImportTok">
     <w:name w:val="ImportTok"/>
     <w:basedOn w:val="VerbatimChar"/>
     <w:rPr>
-      <w:shd w:val="clear" w:fill="f8f8f8"/>
+      <w:b/>
+      <w:color w:val="008000"/>
     </w:rPr>
   </w:style>
   <w:style w:type="character" w:customStyle="1" w:styleId="CommentTok">
@@ -8761,18 +9627,15 @@
     <w:basedOn w:val="VerbatimChar"/>
     <w:rPr>
       <w:i/>
-      <w:color w:val="8f5902"/>
-      <w:shd w:val="clear" w:fill="f8f8f8"/>
+      <w:color w:val="60a0b0"/>
     </w:rPr>
   </w:style>
   <w:style w:type="character" w:customStyle="1" w:styleId="DocumentationTok">
     <w:name w:val="DocumentationTok"/>
     <w:basedOn w:val="VerbatimChar"/>
     <w:rPr>
-      <w:b/>
       <w:i/>
-      <w:color w:val="8f5902"/>
-      <w:shd w:val="clear" w:fill="f8f8f8"/>
+      <w:color w:val="ba2121"/>
     </w:rPr>
   </w:style>
   <w:style w:type="character" w:customStyle="1" w:styleId="AnnotationTok">
@@ -8781,8 +9644,7 @@
     <w:rPr>
       <w:b/>
       <w:i/>
-      <w:color w:val="8f5902"/>
-      <w:shd w:val="clear" w:fill="f8f8f8"/>
+      <w:color w:val="60a0b0"/>
     </w:rPr>
   </w:style>
   <w:style w:type="character" w:customStyle="1" w:styleId="CommentVarTok">
@@ -8791,33 +9653,28 @@
     <w:rPr>
       <w:b/>
       <w:i/>
-      <w:color w:val="8f5902"/>
-      <w:shd w:val="clear" w:fill="f8f8f8"/>
+      <w:color w:val="60a0b0"/>
     </w:rPr>
   </w:style>
   <w:style w:type="character" w:customStyle="1" w:styleId="OtherTok">
     <w:name w:val="OtherTok"/>
     <w:basedOn w:val="VerbatimChar"/>
     <w:rPr>
-      <w:color w:val="8f5902"/>
-      <w:shd w:val="clear" w:fill="f8f8f8"/>
+      <w:color w:val="007020"/>
     </w:rPr>
   </w:style>
   <w:style w:type="character" w:customStyle="1" w:styleId="FunctionTok">
     <w:name w:val="FunctionTok"/>
     <w:basedOn w:val="VerbatimChar"/>
     <w:rPr>
-      <w:b/>
-      <w:color w:val="204a87"/>
-      <w:shd w:val="clear" w:fill="f8f8f8"/>
+      <w:color w:val="06287e"/>
     </w:rPr>
   </w:style>
   <w:style w:type="character" w:customStyle="1" w:styleId="VariableTok">
     <w:name w:val="VariableTok"/>
     <w:basedOn w:val="VerbatimChar"/>
     <w:rPr>
-      <w:color w:val="000000"/>
-      <w:shd w:val="clear" w:fill="f8f8f8"/>
+      <w:color w:val="19177c"/>
     </w:rPr>
   </w:style>
   <w:style w:type="character" w:customStyle="1" w:styleId="ControlFlowTok">
@@ -8825,56 +9682,46 @@
     <w:basedOn w:val="VerbatimChar"/>
     <w:rPr>
       <w:b/>
-      <w:color w:val="204a87"/>
-      <w:shd w:val="clear" w:fill="f8f8f8"/>
+      <w:color w:val="007020"/>
     </w:rPr>
   </w:style>
   <w:style w:type="character" w:customStyle="1" w:styleId="OperatorTok">
     <w:name w:val="OperatorTok"/>
     <w:basedOn w:val="VerbatimChar"/>
     <w:rPr>
-      <w:b/>
-      <w:color w:val="ce5c00"/>
-      <w:shd w:val="clear" w:fill="f8f8f8"/>
+      <w:color w:val="666666"/>
     </w:rPr>
   </w:style>
   <w:style w:type="character" w:customStyle="1" w:styleId="BuiltInTok">
     <w:name w:val="BuiltInTok"/>
     <w:basedOn w:val="VerbatimChar"/>
     <w:rPr>
-      <w:shd w:val="clear" w:fill="f8f8f8"/>
+      <w:color w:val="008000"/>
     </w:rPr>
   </w:style>
   <w:style w:type="character" w:customStyle="1" w:styleId="ExtensionTok">
     <w:name w:val="ExtensionTok"/>
     <w:basedOn w:val="VerbatimChar"/>
-    <w:rPr>
-      <w:shd w:val="clear" w:fill="f8f8f8"/>
-    </w:rPr>
+    <w:rPr/>
   </w:style>
   <w:style w:type="character" w:customStyle="1" w:styleId="PreprocessorTok">
     <w:name w:val="PreprocessorTok"/>
     <w:basedOn w:val="VerbatimChar"/>
     <w:rPr>
-      <w:i/>
-      <w:color w:val="8f5902"/>
-      <w:shd w:val="clear" w:fill="f8f8f8"/>
+      <w:color w:val="bc7a00"/>
     </w:rPr>
   </w:style>
   <w:style w:type="character" w:customStyle="1" w:styleId="AttributeTok">
     <w:name w:val="AttributeTok"/>
     <w:basedOn w:val="VerbatimChar"/>
     <w:rPr>
-      <w:color w:val="204a87"/>
-      <w:shd w:val="clear" w:fill="f8f8f8"/>
+      <w:color w:val="7d9029"/>
     </w:rPr>
   </w:style>
   <w:style w:type="character" w:customStyle="1" w:styleId="RegionMarkerTok">
     <w:name w:val="RegionMarkerTok"/>
     <w:basedOn w:val="VerbatimChar"/>
-    <w:rPr>
-      <w:shd w:val="clear" w:fill="f8f8f8"/>
-    </w:rPr>
+    <w:rPr/>
   </w:style>
   <w:style w:type="character" w:customStyle="1" w:styleId="InformationTok">
     <w:name w:val="InformationTok"/>
@@ -8882,8 +9729,7 @@
     <w:rPr>
       <w:b/>
       <w:i/>
-      <w:color w:val="8f5902"/>
-      <w:shd w:val="clear" w:fill="f8f8f8"/>
+      <w:color w:val="60a0b0"/>
     </w:rPr>
   </w:style>
   <w:style w:type="character" w:customStyle="1" w:styleId="WarningTok">
@@ -8892,16 +9738,15 @@
     <w:rPr>
       <w:b/>
       <w:i/>
-      <w:color w:val="8f5902"/>
-      <w:shd w:val="clear" w:fill="f8f8f8"/>
+      <w:color w:val="60a0b0"/>
     </w:rPr>
   </w:style>
   <w:style w:type="character" w:customStyle="1" w:styleId="AlertTok">
     <w:name w:val="AlertTok"/>
     <w:basedOn w:val="VerbatimChar"/>
     <w:rPr>
-      <w:color w:val="ef2929"/>
-      <w:shd w:val="clear" w:fill="f8f8f8"/>
+      <w:b/>
+      <w:color w:val="ff0000"/>
     </w:rPr>
   </w:style>
   <w:style w:type="character" w:customStyle="1" w:styleId="ErrorTok">
@@ -8909,16 +9754,13 @@
     <w:basedOn w:val="VerbatimChar"/>
     <w:rPr>
       <w:b/>
-      <w:color w:val="a40000"/>
-      <w:shd w:val="clear" w:fill="f8f8f8"/>
+      <w:color w:val="ff0000"/>
     </w:rPr>
   </w:style>
   <w:style w:type="character" w:customStyle="1" w:styleId="NormalTok">
     <w:name w:val="NormalTok"/>
     <w:basedOn w:val="VerbatimChar"/>
-    <w:rPr>
-      <w:shd w:val="clear" w:fill="f8f8f8"/>
-    </w:rPr>
+    <w:rPr/>
   </w:style>
 </w:styles>
 </file>

</xml_diff>

<commit_message>
Add filecache_min_kb=512MB to mitigation plan
</commit_message>
<xml_diff>
--- a/technical-deep-dive.docx
+++ b/technical-deep-dive.docx
@@ -2,7 +2,7 @@
 <file path=word/document.xml><?xml version="1.0" encoding="utf-8"?>
 <w:document xmlns:w="http://schemas.openxmlformats.org/wordprocessingml/2006/main" xmlns:m="http://schemas.openxmlformats.org/officeDocument/2006/math" xmlns:r="http://schemas.openxmlformats.org/officeDocument/2006/relationships" xmlns:o="urn:schemas-microsoft-com:office:office" xmlns:v="urn:schemas-microsoft-com:vml" xmlns:w10="urn:schemas-microsoft-com:office:word" xmlns:a="http://schemas.openxmlformats.org/drawingml/2006/main" xmlns:pic="http://schemas.openxmlformats.org/drawingml/2006/picture" xmlns:wp="http://schemas.openxmlformats.org/drawingml/2006/wordprocessingDrawing">
   <w:body>
-    <w:bookmarkStart w:id="38" w:name="thrpi-354-oom-技術深度分析"/>
+    <w:bookmarkStart w:id="39" w:name="thrpi-354-oom-技術深度分析"/>
     <w:p>
       <w:pPr>
         <w:pStyle w:val="Heading1"/>
@@ -6376,7 +6376,7 @@
     </w:p>
     <w:bookmarkEnd w:id="25"/>
     <w:bookmarkEnd w:id="26"/>
-    <w:bookmarkStart w:id="34" w:name="修正後的-mitigation-plan"/>
+    <w:bookmarkStart w:id="35" w:name="修正後的-mitigation-plan"/>
     <w:p>
       <w:pPr>
         <w:pStyle w:val="Heading2"/>
@@ -7463,13 +7463,657 @@
       </w:r>
     </w:p>
     <w:bookmarkEnd w:id="29"/>
-    <w:bookmarkStart w:id="30" w:name="預期效果"/>
+    <w:bookmarkStart w:id="30" w:name="方向-3file-cache-最低保護filecache_min_kb"/>
     <w:p>
       <w:pPr>
         <w:pStyle w:val="Heading3"/>
       </w:pPr>
       <w:r>
         <w:t xml:space="preserve">4.4 </w:t>
+      </w:r>
+      <w:r>
+        <w:rPr>
+          <w:rFonts w:hint="eastAsia"/>
+        </w:rPr>
+        <w:t xml:space="preserve">方向</w:t>
+      </w:r>
+      <w:r>
+        <w:t xml:space="preserve"> </w:t>
+      </w:r>
+      <w:r>
+        <w:rPr>
+          <w:rFonts w:hint="eastAsia"/>
+        </w:rPr>
+        <w:t xml:space="preserve">3：File</w:t>
+      </w:r>
+      <w:r>
+        <w:t xml:space="preserve"> Cache </w:t>
+      </w:r>
+      <w:r>
+        <w:rPr>
+          <w:rFonts w:hint="eastAsia"/>
+        </w:rPr>
+        <w:t xml:space="preserve">最低保護（filecache_min_kb）</w:t>
+      </w:r>
+    </w:p>
+    <w:p>
+      <w:pPr>
+        <w:pStyle w:val="FirstParagraph"/>
+      </w:pPr>
+      <w:r>
+        <w:t xml:space="preserve">lmkd </w:t>
+      </w:r>
+      <w:r>
+        <w:rPr>
+          <w:rFonts w:hint="eastAsia"/>
+        </w:rPr>
+        <w:t xml:space="preserve">支援</w:t>
+      </w:r>
+      <w:r>
+        <w:t xml:space="preserve"> </w:t>
+      </w:r>
+      <w:r>
+        <w:rPr>
+          <w:rStyle w:val="VerbatimChar"/>
+        </w:rPr>
+        <w:t xml:space="preserve">filecache_min_kb</w:t>
+      </w:r>
+      <w:r>
+        <w:t xml:space="preserve"> </w:t>
+      </w:r>
+      <w:r>
+        <w:t xml:space="preserve">— </w:t>
+      </w:r>
+      <w:r>
+        <w:rPr>
+          <w:rFonts w:hint="eastAsia"/>
+        </w:rPr>
+        <w:t xml:space="preserve">當</w:t>
+      </w:r>
+      <w:r>
+        <w:t xml:space="preserve"> file cache </w:t>
+      </w:r>
+      <w:r>
+        <w:rPr>
+          <w:rFonts w:hint="eastAsia"/>
+        </w:rPr>
+        <w:t xml:space="preserve">低於此值時，lmkd</w:t>
+      </w:r>
+      <w:r>
+        <w:t xml:space="preserve"> </w:t>
+      </w:r>
+      <w:r>
+        <w:rPr>
+          <w:rFonts w:hint="eastAsia"/>
+        </w:rPr>
+        <w:t xml:space="preserve">更積極</w:t>
+      </w:r>
+      <w:r>
+        <w:t xml:space="preserve"> kill cached apps </w:t>
+      </w:r>
+      <w:r>
+        <w:rPr>
+          <w:rFonts w:hint="eastAsia"/>
+        </w:rPr>
+        <w:t xml:space="preserve">來間接保護</w:t>
+      </w:r>
+      <w:r>
+        <w:t xml:space="preserve"> file cache。</w:t>
+      </w:r>
+    </w:p>
+    <w:tbl>
+      <w:tblPr>
+        <w:tblStyle w:val="Table"/>
+        <w:tblW w:type="pct" w:w="5000"/>
+        <w:tblLayout w:type="fixed"/>
+        <w:tblLook w:firstRow="1" w:lastRow="0" w:firstColumn="0" w:lastColumn="0" w:noHBand="0" w:noVBand="0" w:val="0020"/>
+      </w:tblPr>
+      <w:tblGrid>
+        <w:gridCol w:w="1697"/>
+        <w:gridCol w:w="2262"/>
+        <w:gridCol w:w="2262"/>
+        <w:gridCol w:w="1697"/>
+      </w:tblGrid>
+      <w:tr>
+        <w:trPr>
+          <w:tblHeader w:val="on"/>
+        </w:trPr>
+        <w:tc>
+          <w:tcPr/>
+          <w:p>
+            <w:pPr>
+              <w:pStyle w:val="Compact"/>
+            </w:pPr>
+            <w:r>
+              <w:rPr>
+                <w:rFonts w:hint="eastAsia"/>
+              </w:rPr>
+              <w:t xml:space="preserve">參數</w:t>
+            </w:r>
+          </w:p>
+        </w:tc>
+        <w:tc>
+          <w:tcPr/>
+          <w:p>
+            <w:pPr>
+              <w:pStyle w:val="Compact"/>
+            </w:pPr>
+            <w:r>
+              <w:rPr>
+                <w:rFonts w:hint="eastAsia"/>
+              </w:rPr>
+              <w:t xml:space="preserve">原始值</w:t>
+            </w:r>
+          </w:p>
+        </w:tc>
+        <w:tc>
+          <w:tcPr/>
+          <w:p>
+            <w:pPr>
+              <w:pStyle w:val="Compact"/>
+            </w:pPr>
+            <w:r>
+              <w:rPr>
+                <w:rFonts w:hint="eastAsia"/>
+              </w:rPr>
+              <w:t xml:space="preserve">修改值</w:t>
+            </w:r>
+          </w:p>
+        </w:tc>
+        <w:tc>
+          <w:tcPr/>
+          <w:p>
+            <w:pPr>
+              <w:pStyle w:val="Compact"/>
+            </w:pPr>
+            <w:r>
+              <w:rPr>
+                <w:rFonts w:hint="eastAsia"/>
+              </w:rPr>
+              <w:t xml:space="preserve">效果</w:t>
+            </w:r>
+          </w:p>
+        </w:tc>
+      </w:tr>
+      <w:tr>
+        <w:tc>
+          <w:tcPr/>
+          <w:p>
+            <w:pPr>
+              <w:pStyle w:val="Compact"/>
+            </w:pPr>
+            <w:r>
+              <w:rPr>
+                <w:b/>
+                <w:bCs/>
+              </w:rPr>
+              <w:t xml:space="preserve">filecache_min_kb</w:t>
+            </w:r>
+          </w:p>
+        </w:tc>
+        <w:tc>
+          <w:tcPr/>
+          <w:p>
+            <w:pPr>
+              <w:pStyle w:val="Compact"/>
+            </w:pPr>
+            <w:r>
+              <w:rPr>
+                <w:rFonts w:hint="eastAsia"/>
+              </w:rPr>
+              <w:t xml:space="preserve">0（無保護）</w:t>
+            </w:r>
+          </w:p>
+        </w:tc>
+        <w:tc>
+          <w:tcPr/>
+          <w:p>
+            <w:pPr>
+              <w:pStyle w:val="Compact"/>
+            </w:pPr>
+            <w:r>
+              <w:rPr>
+                <w:b/>
+                <w:bCs/>
+              </w:rPr>
+              <w:t xml:space="preserve">524288</w:t>
+            </w:r>
+            <w:r>
+              <w:rPr>
+                <w:rFonts w:hint="eastAsia"/>
+              </w:rPr>
+              <w:t xml:space="preserve">（512</w:t>
+            </w:r>
+            <w:r>
+              <w:t xml:space="preserve"> </w:t>
+            </w:r>
+            <w:r>
+              <w:rPr>
+                <w:rFonts w:hint="eastAsia"/>
+              </w:rPr>
+              <w:t xml:space="preserve">MB）</w:t>
+            </w:r>
+          </w:p>
+        </w:tc>
+        <w:tc>
+          <w:tcPr/>
+          <w:p>
+            <w:pPr>
+              <w:pStyle w:val="Compact"/>
+            </w:pPr>
+            <w:r>
+              <w:t xml:space="preserve">file cache &lt; 512MB </w:t>
+            </w:r>
+            <w:r>
+              <w:rPr>
+                <w:rFonts w:hint="eastAsia"/>
+              </w:rPr>
+              <w:t xml:space="preserve">時積極</w:t>
+            </w:r>
+            <w:r>
+              <w:t xml:space="preserve"> kill cached apps</w:t>
+            </w:r>
+          </w:p>
+        </w:tc>
+      </w:tr>
+    </w:tbl>
+    <w:p>
+      <w:pPr>
+        <w:pStyle w:val="SourceCode"/>
+      </w:pPr>
+      <w:r>
+        <w:rPr>
+          <w:rStyle w:val="VerbatimChar"/>
+          <w:rFonts w:hint="eastAsia"/>
+        </w:rPr>
+        <w:t xml:space="preserve">設定方式（runtime</w:t>
+      </w:r>
+      <w:r>
+        <w:rPr>
+          <w:rStyle w:val="VerbatimChar"/>
+        </w:rPr>
+        <w:t xml:space="preserve"> </w:t>
+      </w:r>
+      <w:r>
+        <w:rPr>
+          <w:rStyle w:val="VerbatimChar"/>
+          <w:rFonts w:hint="eastAsia"/>
+        </w:rPr>
+        <w:t xml:space="preserve">生效，重啟保留）：</w:t>
+      </w:r>
+      <w:r>
+        <w:br/>
+      </w:r>
+      <w:r>
+        <w:rPr>
+          <w:rStyle w:val="VerbatimChar"/>
+        </w:rPr>
+        <w:t xml:space="preserve">  persist.device_config.lmkd_native.filecache_min_kb=524288</w:t>
+      </w:r>
+      <w:r>
+        <w:br/>
+      </w:r>
+      <w:r>
+        <w:br/>
+      </w:r>
+      <w:r>
+        <w:rPr>
+          <w:rStyle w:val="VerbatimChar"/>
+          <w:rFonts w:hint="eastAsia"/>
+        </w:rPr>
+        <w:t xml:space="preserve">運作原理：</w:t>
+      </w:r>
+      <w:r>
+        <w:br/>
+      </w:r>
+      <w:r>
+        <w:rPr>
+          <w:rStyle w:val="VerbatimChar"/>
+        </w:rPr>
+        <w:t xml:space="preserve">  lmkd </w:t>
+      </w:r>
+      <w:r>
+        <w:rPr>
+          <w:rStyle w:val="VerbatimChar"/>
+          <w:rFonts w:hint="eastAsia"/>
+        </w:rPr>
+        <w:t xml:space="preserve">收到</w:t>
+      </w:r>
+      <w:r>
+        <w:rPr>
+          <w:rStyle w:val="VerbatimChar"/>
+        </w:rPr>
+        <w:t xml:space="preserve"> PSI event → </w:t>
+      </w:r>
+      <w:r>
+        <w:rPr>
+          <w:rStyle w:val="VerbatimChar"/>
+          <w:rFonts w:hint="eastAsia"/>
+        </w:rPr>
+        <w:t xml:space="preserve">檢查</w:t>
+      </w:r>
+      <w:r>
+        <w:rPr>
+          <w:rStyle w:val="VerbatimChar"/>
+        </w:rPr>
+        <w:t xml:space="preserve"> file_pages</w:t>
+      </w:r>
+      <w:r>
+        <w:br/>
+      </w:r>
+      <w:r>
+        <w:rPr>
+          <w:rStyle w:val="VerbatimChar"/>
+        </w:rPr>
+        <w:t xml:space="preserve">  → file_pages &lt; 512 MB → </w:t>
+      </w:r>
+      <w:r>
+        <w:rPr>
+          <w:rStyle w:val="VerbatimChar"/>
+          <w:rFonts w:hint="eastAsia"/>
+        </w:rPr>
+        <w:t xml:space="preserve">降低</w:t>
+      </w:r>
+      <w:r>
+        <w:rPr>
+          <w:rStyle w:val="VerbatimChar"/>
+        </w:rPr>
+        <w:t xml:space="preserve"> </w:t>
+      </w:r>
+      <w:r>
+        <w:rPr>
+          <w:rStyle w:val="VerbatimChar"/>
+          <w:rFonts w:hint="eastAsia"/>
+        </w:rPr>
+        <w:t xml:space="preserve">min_score_adj（更積極</w:t>
+      </w:r>
+      <w:r>
+        <w:rPr>
+          <w:rStyle w:val="VerbatimChar"/>
+        </w:rPr>
+        <w:t xml:space="preserve"> </w:t>
+      </w:r>
+      <w:r>
+        <w:rPr>
+          <w:rStyle w:val="VerbatimChar"/>
+          <w:rFonts w:hint="eastAsia"/>
+        </w:rPr>
+        <w:t xml:space="preserve">kill）</w:t>
+      </w:r>
+      <w:r>
+        <w:br/>
+      </w:r>
+      <w:r>
+        <w:rPr>
+          <w:rStyle w:val="VerbatimChar"/>
+        </w:rPr>
+        <w:t xml:space="preserve">  → kill cached apps → </w:t>
+      </w:r>
+      <w:r>
+        <w:rPr>
+          <w:rStyle w:val="VerbatimChar"/>
+          <w:rFonts w:hint="eastAsia"/>
+        </w:rPr>
+        <w:t xml:space="preserve">釋放</w:t>
+      </w:r>
+      <w:r>
+        <w:rPr>
+          <w:rStyle w:val="VerbatimChar"/>
+        </w:rPr>
+        <w:t xml:space="preserve"> anon pages → kswapd </w:t>
+      </w:r>
+      <w:r>
+        <w:rPr>
+          <w:rStyle w:val="VerbatimChar"/>
+          <w:rFonts w:hint="eastAsia"/>
+        </w:rPr>
+        <w:t xml:space="preserve">壓力減輕</w:t>
+      </w:r>
+      <w:r>
+        <w:br/>
+      </w:r>
+      <w:r>
+        <w:rPr>
+          <w:rStyle w:val="VerbatimChar"/>
+        </w:rPr>
+        <w:t xml:space="preserve">  → file cache </w:t>
+      </w:r>
+      <w:r>
+        <w:rPr>
+          <w:rStyle w:val="VerbatimChar"/>
+          <w:rFonts w:hint="eastAsia"/>
+        </w:rPr>
+        <w:t xml:space="preserve">不再被壓到</w:t>
+      </w:r>
+      <w:r>
+        <w:rPr>
+          <w:rStyle w:val="VerbatimChar"/>
+        </w:rPr>
+        <w:t xml:space="preserve"> 388 MB</w:t>
+      </w:r>
+      <w:r>
+        <w:br/>
+      </w:r>
+      <w:r>
+        <w:br/>
+      </w:r>
+      <w:r>
+        <w:rPr>
+          <w:rStyle w:val="VerbatimChar"/>
+          <w:rFonts w:hint="eastAsia"/>
+        </w:rPr>
+        <w:t xml:space="preserve">為什麼選</w:t>
+      </w:r>
+      <w:r>
+        <w:rPr>
+          <w:rStyle w:val="VerbatimChar"/>
+        </w:rPr>
+        <w:t xml:space="preserve"> 512 </w:t>
+      </w:r>
+      <w:r>
+        <w:rPr>
+          <w:rStyle w:val="VerbatimChar"/>
+          <w:rFonts w:hint="eastAsia"/>
+        </w:rPr>
+        <w:t xml:space="preserve">MB：</w:t>
+      </w:r>
+      <w:r>
+        <w:br/>
+      </w:r>
+      <w:r>
+        <w:rPr>
+          <w:rStyle w:val="VerbatimChar"/>
+        </w:rPr>
+        <w:t xml:space="preserve">  bugreport </w:t>
+      </w:r>
+      <w:r>
+        <w:rPr>
+          <w:rStyle w:val="VerbatimChar"/>
+          <w:rFonts w:hint="eastAsia"/>
+        </w:rPr>
+        <w:t xml:space="preserve">顯示</w:t>
+      </w:r>
+      <w:r>
+        <w:rPr>
+          <w:rStyle w:val="VerbatimChar"/>
+        </w:rPr>
+        <w:t xml:space="preserve"> FBG working set </w:t>
+      </w:r>
+      <w:r>
+        <w:rPr>
+          <w:rStyle w:val="VerbatimChar"/>
+          <w:rFonts w:hint="eastAsia"/>
+        </w:rPr>
+        <w:t xml:space="preserve">約</w:t>
+      </w:r>
+      <w:r>
+        <w:rPr>
+          <w:rStyle w:val="VerbatimChar"/>
+        </w:rPr>
+        <w:t xml:space="preserve"> 388~618 MB</w:t>
+      </w:r>
+      <w:r>
+        <w:br/>
+      </w:r>
+      <w:r>
+        <w:rPr>
+          <w:rStyle w:val="VerbatimChar"/>
+        </w:rPr>
+        <w:t xml:space="preserve">  </w:t>
+      </w:r>
+      <w:r>
+        <w:rPr>
+          <w:rStyle w:val="VerbatimChar"/>
+          <w:rFonts w:hint="eastAsia"/>
+        </w:rPr>
+        <w:t xml:space="preserve">設</w:t>
+      </w:r>
+      <w:r>
+        <w:rPr>
+          <w:rStyle w:val="VerbatimChar"/>
+        </w:rPr>
+        <w:t xml:space="preserve"> 512 MB </w:t>
+      </w:r>
+      <w:r>
+        <w:rPr>
+          <w:rStyle w:val="VerbatimChar"/>
+          <w:rFonts w:hint="eastAsia"/>
+        </w:rPr>
+        <w:t xml:space="preserve">確保</w:t>
+      </w:r>
+      <w:r>
+        <w:rPr>
+          <w:rStyle w:val="VerbatimChar"/>
+        </w:rPr>
+        <w:t xml:space="preserve"> file cache </w:t>
+      </w:r>
+      <w:r>
+        <w:rPr>
+          <w:rStyle w:val="VerbatimChar"/>
+          <w:rFonts w:hint="eastAsia"/>
+        </w:rPr>
+        <w:t xml:space="preserve">維持在</w:t>
+      </w:r>
+      <w:r>
+        <w:rPr>
+          <w:rStyle w:val="VerbatimChar"/>
+        </w:rPr>
+        <w:t xml:space="preserve"> working set </w:t>
+      </w:r>
+      <w:r>
+        <w:rPr>
+          <w:rStyle w:val="VerbatimChar"/>
+          <w:rFonts w:hint="eastAsia"/>
+        </w:rPr>
+        <w:t xml:space="preserve">附近</w:t>
+      </w:r>
+      <w:r>
+        <w:br/>
+      </w:r>
+      <w:r>
+        <w:rPr>
+          <w:rStyle w:val="VerbatimChar"/>
+        </w:rPr>
+        <w:t xml:space="preserve">  </w:t>
+      </w:r>
+      <w:r>
+        <w:rPr>
+          <w:rStyle w:val="VerbatimChar"/>
+          <w:rFonts w:hint="eastAsia"/>
+        </w:rPr>
+        <w:t xml:space="preserve">低於</w:t>
+      </w:r>
+      <w:r>
+        <w:rPr>
+          <w:rStyle w:val="VerbatimChar"/>
+        </w:rPr>
+        <w:t xml:space="preserve"> 512 MB </w:t>
+      </w:r>
+      <w:r>
+        <w:rPr>
+          <w:rStyle w:val="VerbatimChar"/>
+          <w:rFonts w:hint="eastAsia"/>
+        </w:rPr>
+        <w:t xml:space="preserve">時</w:t>
+      </w:r>
+      <w:r>
+        <w:rPr>
+          <w:rStyle w:val="VerbatimChar"/>
+        </w:rPr>
+        <w:t xml:space="preserve"> lmkd </w:t>
+      </w:r>
+      <w:r>
+        <w:rPr>
+          <w:rStyle w:val="VerbatimChar"/>
+          <w:rFonts w:hint="eastAsia"/>
+        </w:rPr>
+        <w:t xml:space="preserve">會介入保護</w:t>
+      </w:r>
+    </w:p>
+    <w:p>
+      <w:pPr>
+        <w:pStyle w:val="FirstParagraph"/>
+      </w:pPr>
+      <w:r>
+        <w:rPr>
+          <w:rFonts w:hint="eastAsia"/>
+        </w:rPr>
+        <w:t xml:space="preserve">注意：這不是</w:t>
+      </w:r>
+      <w:r>
+        <w:t xml:space="preserve"> kernel </w:t>
+      </w:r>
+      <w:r>
+        <w:rPr>
+          <w:rFonts w:hint="eastAsia"/>
+        </w:rPr>
+        <w:t xml:space="preserve">層級的保護。是</w:t>
+      </w:r>
+      <w:r>
+        <w:t xml:space="preserve"> lmkd </w:t>
+      </w:r>
+      <w:r>
+        <w:rPr>
+          <w:rFonts w:hint="eastAsia"/>
+        </w:rPr>
+        <w:t xml:space="preserve">的決策參考</w:t>
+      </w:r>
+      <w:r>
+        <w:t xml:space="preserve"> — </w:t>
+      </w:r>
+      <w:r>
+        <w:rPr>
+          <w:rFonts w:hint="eastAsia"/>
+        </w:rPr>
+        <w:t xml:space="preserve">透過更積極</w:t>
+      </w:r>
+      <w:r>
+        <w:t xml:space="preserve"> kill cached apps </w:t>
+      </w:r>
+      <w:r>
+        <w:rPr>
+          <w:rFonts w:hint="eastAsia"/>
+        </w:rPr>
+        <w:t xml:space="preserve">來間接保護</w:t>
+      </w:r>
+      <w:r>
+        <w:t xml:space="preserve"> file cache </w:t>
+      </w:r>
+      <w:r>
+        <w:rPr>
+          <w:rFonts w:hint="eastAsia"/>
+        </w:rPr>
+        <w:t xml:space="preserve">水位。</w:t>
+      </w:r>
+    </w:p>
+    <w:bookmarkEnd w:id="30"/>
+    <w:bookmarkStart w:id="31" w:name="預期效果"/>
+    <w:p>
+      <w:pPr>
+        <w:pStyle w:val="Heading3"/>
+      </w:pPr>
+      <w:r>
+        <w:t xml:space="preserve">4.5 </w:t>
       </w:r>
       <w:r>
         <w:rPr>
@@ -7552,8 +8196,8 @@
         <w:t xml:space="preserve"> working set</w:t>
       </w:r>
     </w:p>
-    <w:bookmarkEnd w:id="30"/>
-    <w:bookmarkStart w:id="31" w:name="實現方式"/>
+    <w:bookmarkEnd w:id="31"/>
+    <w:bookmarkStart w:id="32" w:name="實現方式"/>
     <w:p>
       <w:pPr>
         <w:pStyle w:val="Heading3"/>
@@ -7698,9 +8342,18 @@
         </w:rPr>
         <w:t xml:space="preserve">sys.sysctl.extra_free_kbytes=54674</w:t>
       </w:r>
+      <w:r>
+        <w:br/>
+      </w:r>
+      <w:r>
+        <w:rPr>
+          <w:rStyle w:val="VerbatimChar"/>
+        </w:rPr>
+        <w:t xml:space="preserve">persist.device_config.lmkd_native.filecache_min_kb=524288</w:t>
+      </w:r>
     </w:p>
-    <w:bookmarkEnd w:id="31"/>
-    <w:bookmarkStart w:id="32" w:name="評估後排除的方案"/>
+    <w:bookmarkEnd w:id="32"/>
+    <w:bookmarkStart w:id="33" w:name="評估後排除的方案"/>
     <w:p>
       <w:pPr>
         <w:pStyle w:val="Heading3"/>
@@ -7912,8 +8565,8 @@
         </w:tc>
       </w:tr>
     </w:tbl>
-    <w:bookmarkEnd w:id="32"/>
-    <w:bookmarkStart w:id="33" w:name="風險評估"/>
+    <w:bookmarkEnd w:id="33"/>
+    <w:bookmarkStart w:id="34" w:name="風險評估"/>
     <w:p>
       <w:pPr>
         <w:pStyle w:val="Heading3"/>
@@ -7926,6 +8579,411 @@
           <w:rFonts w:hint="eastAsia"/>
         </w:rPr>
         <w:t xml:space="preserve">風險評估</w:t>
+      </w:r>
+    </w:p>
+    <w:tbl>
+      <w:tblPr>
+        <w:tblStyle w:val="Table"/>
+        <w:tblW w:type="pct" w:w="5000"/>
+        <w:tblLayout w:type="fixed"/>
+        <w:tblLook w:firstRow="1" w:lastRow="0" w:firstColumn="0" w:lastColumn="0" w:noHBand="0" w:noVBand="0" w:val="0020"/>
+      </w:tblPr>
+      <w:tblGrid>
+        <w:gridCol w:w="2640"/>
+        <w:gridCol w:w="2640"/>
+        <w:gridCol w:w="2640"/>
+      </w:tblGrid>
+      <w:tr>
+        <w:trPr>
+          <w:tblHeader w:val="on"/>
+        </w:trPr>
+        <w:tc>
+          <w:tcPr/>
+          <w:p>
+            <w:pPr>
+              <w:pStyle w:val="Compact"/>
+            </w:pPr>
+            <w:r>
+              <w:rPr>
+                <w:rFonts w:hint="eastAsia"/>
+              </w:rPr>
+              <w:t xml:space="preserve">修改</w:t>
+            </w:r>
+          </w:p>
+        </w:tc>
+        <w:tc>
+          <w:tcPr/>
+          <w:p>
+            <w:pPr>
+              <w:pStyle w:val="Compact"/>
+            </w:pPr>
+            <w:r>
+              <w:rPr>
+                <w:rFonts w:hint="eastAsia"/>
+              </w:rPr>
+              <w:t xml:space="preserve">風險</w:t>
+            </w:r>
+          </w:p>
+        </w:tc>
+        <w:tc>
+          <w:tcPr/>
+          <w:p>
+            <w:pPr>
+              <w:pStyle w:val="Compact"/>
+            </w:pPr>
+            <w:r>
+              <w:rPr>
+                <w:rFonts w:hint="eastAsia"/>
+              </w:rPr>
+              <w:t xml:space="preserve">影響</w:t>
+            </w:r>
+          </w:p>
+        </w:tc>
+      </w:tr>
+      <w:tr>
+        <w:tc>
+          <w:tcPr/>
+          <w:p>
+            <w:pPr>
+              <w:pStyle w:val="Compact"/>
+            </w:pPr>
+            <w:r>
+              <w:t xml:space="preserve">dirty_ratio 20→5</w:t>
+            </w:r>
+          </w:p>
+        </w:tc>
+        <w:tc>
+          <w:tcPr/>
+          <w:p>
+            <w:pPr>
+              <w:pStyle w:val="Compact"/>
+            </w:pPr>
+            <w:r>
+              <w:rPr>
+                <w:rFonts w:hint="eastAsia"/>
+              </w:rPr>
+              <w:t xml:space="preserve">低</w:t>
+            </w:r>
+          </w:p>
+        </w:tc>
+        <w:tc>
+          <w:tcPr/>
+          <w:p>
+            <w:pPr>
+              <w:pStyle w:val="Compact"/>
+            </w:pPr>
+            <w:r>
+              <w:rPr>
+                <w:rFonts w:hint="eastAsia"/>
+              </w:rPr>
+              <w:t xml:space="preserve">大量寫入</w:t>
+            </w:r>
+            <w:r>
+              <w:t xml:space="preserve"> throughput </w:t>
+            </w:r>
+            <w:r>
+              <w:rPr>
+                <w:rFonts w:hint="eastAsia"/>
+              </w:rPr>
+              <w:t xml:space="preserve">降低，一般使用無感</w:t>
+            </w:r>
+          </w:p>
+        </w:tc>
+      </w:tr>
+      <w:tr>
+        <w:tc>
+          <w:tcPr/>
+          <w:p>
+            <w:pPr>
+              <w:pStyle w:val="Compact"/>
+            </w:pPr>
+            <w:r>
+              <w:t xml:space="preserve">dirty_background_ratio 10→3</w:t>
+            </w:r>
+          </w:p>
+        </w:tc>
+        <w:tc>
+          <w:tcPr/>
+          <w:p>
+            <w:pPr>
+              <w:pStyle w:val="Compact"/>
+            </w:pPr>
+            <w:r>
+              <w:rPr>
+                <w:rFonts w:hint="eastAsia"/>
+              </w:rPr>
+              <w:t xml:space="preserve">低</w:t>
+            </w:r>
+          </w:p>
+        </w:tc>
+        <w:tc>
+          <w:tcPr/>
+          <w:p>
+            <w:pPr>
+              <w:pStyle w:val="Compact"/>
+            </w:pPr>
+            <w:r>
+              <w:t xml:space="preserve">writeback </w:t>
+            </w:r>
+            <w:r>
+              <w:rPr>
+                <w:rFonts w:hint="eastAsia"/>
+              </w:rPr>
+              <w:t xml:space="preserve">更頻繁，輕微增加</w:t>
+            </w:r>
+            <w:r>
+              <w:t xml:space="preserve"> I/O</w:t>
+            </w:r>
+          </w:p>
+        </w:tc>
+      </w:tr>
+      <w:tr>
+        <w:tc>
+          <w:tcPr/>
+          <w:p>
+            <w:pPr>
+              <w:pStyle w:val="Compact"/>
+            </w:pPr>
+            <w:r>
+              <w:t xml:space="preserve">minfree adj=950 </w:t>
+            </w:r>
+            <w:r>
+              <w:rPr>
+                <w:rFonts w:hint="eastAsia"/>
+              </w:rPr>
+              <w:t xml:space="preserve">提高</w:t>
+            </w:r>
+          </w:p>
+        </w:tc>
+        <w:tc>
+          <w:tcPr/>
+          <w:p>
+            <w:pPr>
+              <w:pStyle w:val="Compact"/>
+            </w:pPr>
+            <w:r>
+              <w:rPr>
+                <w:rFonts w:hint="eastAsia"/>
+              </w:rPr>
+              <w:t xml:space="preserve">低</w:t>
+            </w:r>
+          </w:p>
+        </w:tc>
+        <w:tc>
+          <w:tcPr/>
+          <w:p>
+            <w:pPr>
+              <w:pStyle w:val="Compact"/>
+            </w:pPr>
+            <w:r>
+              <w:rPr>
+                <w:rFonts w:hint="eastAsia"/>
+              </w:rPr>
+              <w:t xml:space="preserve">背景</w:t>
+            </w:r>
+            <w:r>
+              <w:t xml:space="preserve"> app cold start </w:t>
+            </w:r>
+            <w:r>
+              <w:rPr>
+                <w:rFonts w:hint="eastAsia"/>
+              </w:rPr>
+              <w:t xml:space="preserve">機率增加</w:t>
+            </w:r>
+          </w:p>
+        </w:tc>
+      </w:tr>
+      <w:tr>
+        <w:tc>
+          <w:tcPr/>
+          <w:p>
+            <w:pPr>
+              <w:pStyle w:val="Compact"/>
+            </w:pPr>
+            <w:r>
+              <w:t xml:space="preserve">filecache_min_kb=512MB</w:t>
+            </w:r>
+          </w:p>
+        </w:tc>
+        <w:tc>
+          <w:tcPr/>
+          <w:p>
+            <w:pPr>
+              <w:pStyle w:val="Compact"/>
+            </w:pPr>
+            <w:r>
+              <w:rPr>
+                <w:rFonts w:hint="eastAsia"/>
+              </w:rPr>
+              <w:t xml:space="preserve">低</w:t>
+            </w:r>
+          </w:p>
+        </w:tc>
+        <w:tc>
+          <w:tcPr/>
+          <w:p>
+            <w:pPr>
+              <w:pStyle w:val="Compact"/>
+            </w:pPr>
+            <w:r>
+              <w:t xml:space="preserve">file cache </w:t>
+            </w:r>
+            <w:r>
+              <w:rPr>
+                <w:rFonts w:hint="eastAsia"/>
+              </w:rPr>
+              <w:t xml:space="preserve">低於</w:t>
+            </w:r>
+            <w:r>
+              <w:t xml:space="preserve"> 512MB </w:t>
+            </w:r>
+            <w:r>
+              <w:rPr>
+                <w:rFonts w:hint="eastAsia"/>
+              </w:rPr>
+              <w:t xml:space="preserve">時更積極</w:t>
+            </w:r>
+            <w:r>
+              <w:t xml:space="preserve"> kill cached apps</w:t>
+            </w:r>
+          </w:p>
+        </w:tc>
+      </w:tr>
+      <w:tr>
+        <w:tc>
+          <w:tcPr/>
+          <w:p>
+            <w:pPr>
+              <w:pStyle w:val="Compact"/>
+            </w:pPr>
+            <w:r>
+              <w:t xml:space="preserve">vfs_cache_pressure 100→150</w:t>
+            </w:r>
+          </w:p>
+        </w:tc>
+        <w:tc>
+          <w:tcPr/>
+          <w:p>
+            <w:pPr>
+              <w:pStyle w:val="Compact"/>
+            </w:pPr>
+            <w:r>
+              <w:rPr>
+                <w:rFonts w:hint="eastAsia"/>
+              </w:rPr>
+              <w:t xml:space="preserve">低</w:t>
+            </w:r>
+          </w:p>
+        </w:tc>
+        <w:tc>
+          <w:tcPr/>
+          <w:p>
+            <w:pPr>
+              <w:pStyle w:val="Compact"/>
+            </w:pPr>
+            <w:r>
+              <w:rPr>
+                <w:rFonts w:hint="eastAsia"/>
+              </w:rPr>
+              <w:t xml:space="preserve">輕微</w:t>
+            </w:r>
+            <w:r>
+              <w:t xml:space="preserve"> cache miss</w:t>
+            </w:r>
+          </w:p>
+        </w:tc>
+      </w:tr>
+    </w:tbl>
+    <w:p>
+      <w:r>
+        <w:pict>
+          <v:rect style="width:0;height:1.5pt" o:hralign="center" o:hrstd="t" o:hr="t"/>
+        </w:pict>
+      </w:r>
+    </w:p>
+    <w:bookmarkEnd w:id="34"/>
+    <w:bookmarkEnd w:id="35"/>
+    <w:bookmarkStart w:id="36" w:name="oom-reaper-說明"/>
+    <w:p>
+      <w:pPr>
+        <w:pStyle w:val="Heading2"/>
+      </w:pPr>
+      <w:r>
+        <w:t xml:space="preserve">5. OOM Reaper </w:t>
+      </w:r>
+      <w:r>
+        <w:rPr>
+          <w:rFonts w:hint="eastAsia"/>
+        </w:rPr>
+        <w:t xml:space="preserve">說明</w:t>
+      </w:r>
+    </w:p>
+    <w:p>
+      <w:pPr>
+        <w:pStyle w:val="FirstParagraph"/>
+      </w:pPr>
+      <w:r>
+        <w:rPr>
+          <w:rStyle w:val="VerbatimChar"/>
+        </w:rPr>
+        <w:t xml:space="preserve">oom_reaper</w:t>
+      </w:r>
+      <w:r>
+        <w:t xml:space="preserve"> </w:t>
+      </w:r>
+      <w:r>
+        <w:rPr>
+          <w:rFonts w:hint="eastAsia"/>
+        </w:rPr>
+        <w:t xml:space="preserve">是</w:t>
+      </w:r>
+      <w:r>
+        <w:t xml:space="preserve"> kernel </w:t>
+      </w:r>
+      <w:r>
+        <w:rPr>
+          <w:rFonts w:hint="eastAsia"/>
+        </w:rPr>
+        <w:t xml:space="preserve">thread，在</w:t>
+      </w:r>
+      <w:r>
+        <w:t xml:space="preserve"> process </w:t>
+      </w:r>
+      <w:r>
+        <w:rPr>
+          <w:rFonts w:hint="eastAsia"/>
+        </w:rPr>
+        <w:t xml:space="preserve">被</w:t>
+      </w:r>
+      <w:r>
+        <w:t xml:space="preserve"> SIGKILL </w:t>
+      </w:r>
+      <w:r>
+        <w:rPr>
+          <w:rFonts w:hint="eastAsia"/>
+        </w:rPr>
+        <w:t xml:space="preserve">後快速回收</w:t>
+      </w:r>
+      <w:r>
+        <w:t xml:space="preserve"> anonymous </w:t>
+      </w:r>
+      <w:r>
+        <w:rPr>
+          <w:rFonts w:hint="eastAsia"/>
+        </w:rPr>
+        <w:t xml:space="preserve">memory，不等</w:t>
+      </w:r>
+      <w:r>
+        <w:t xml:space="preserve"> process </w:t>
+      </w:r>
+      <w:r>
+        <w:rPr>
+          <w:rFonts w:hint="eastAsia"/>
+        </w:rPr>
+        <w:t xml:space="preserve">自己</w:t>
+      </w:r>
+      <w:r>
+        <w:t xml:space="preserve"> exit。</w:t>
       </w:r>
     </w:p>
     <w:tbl>
@@ -7949,354 +9007,6 @@
             <w:pPr>
               <w:pStyle w:val="Compact"/>
             </w:pPr>
-            <w:r>
-              <w:rPr>
-                <w:rFonts w:hint="eastAsia"/>
-              </w:rPr>
-              <w:t xml:space="preserve">修改</w:t>
-            </w:r>
-          </w:p>
-        </w:tc>
-        <w:tc>
-          <w:tcPr/>
-          <w:p>
-            <w:pPr>
-              <w:pStyle w:val="Compact"/>
-            </w:pPr>
-            <w:r>
-              <w:rPr>
-                <w:rFonts w:hint="eastAsia"/>
-              </w:rPr>
-              <w:t xml:space="preserve">風險</w:t>
-            </w:r>
-          </w:p>
-        </w:tc>
-        <w:tc>
-          <w:tcPr/>
-          <w:p>
-            <w:pPr>
-              <w:pStyle w:val="Compact"/>
-            </w:pPr>
-            <w:r>
-              <w:rPr>
-                <w:rFonts w:hint="eastAsia"/>
-              </w:rPr>
-              <w:t xml:space="preserve">影響</w:t>
-            </w:r>
-          </w:p>
-        </w:tc>
-      </w:tr>
-      <w:tr>
-        <w:tc>
-          <w:tcPr/>
-          <w:p>
-            <w:pPr>
-              <w:pStyle w:val="Compact"/>
-            </w:pPr>
-            <w:r>
-              <w:t xml:space="preserve">dirty_ratio 20→5</w:t>
-            </w:r>
-          </w:p>
-        </w:tc>
-        <w:tc>
-          <w:tcPr/>
-          <w:p>
-            <w:pPr>
-              <w:pStyle w:val="Compact"/>
-            </w:pPr>
-            <w:r>
-              <w:rPr>
-                <w:rFonts w:hint="eastAsia"/>
-              </w:rPr>
-              <w:t xml:space="preserve">低</w:t>
-            </w:r>
-          </w:p>
-        </w:tc>
-        <w:tc>
-          <w:tcPr/>
-          <w:p>
-            <w:pPr>
-              <w:pStyle w:val="Compact"/>
-            </w:pPr>
-            <w:r>
-              <w:rPr>
-                <w:rFonts w:hint="eastAsia"/>
-              </w:rPr>
-              <w:t xml:space="preserve">大量寫入</w:t>
-            </w:r>
-            <w:r>
-              <w:t xml:space="preserve"> throughput </w:t>
-            </w:r>
-            <w:r>
-              <w:rPr>
-                <w:rFonts w:hint="eastAsia"/>
-              </w:rPr>
-              <w:t xml:space="preserve">降低，一般使用無感</w:t>
-            </w:r>
-          </w:p>
-        </w:tc>
-      </w:tr>
-      <w:tr>
-        <w:tc>
-          <w:tcPr/>
-          <w:p>
-            <w:pPr>
-              <w:pStyle w:val="Compact"/>
-            </w:pPr>
-            <w:r>
-              <w:t xml:space="preserve">dirty_background_ratio 10→3</w:t>
-            </w:r>
-          </w:p>
-        </w:tc>
-        <w:tc>
-          <w:tcPr/>
-          <w:p>
-            <w:pPr>
-              <w:pStyle w:val="Compact"/>
-            </w:pPr>
-            <w:r>
-              <w:rPr>
-                <w:rFonts w:hint="eastAsia"/>
-              </w:rPr>
-              <w:t xml:space="preserve">低</w:t>
-            </w:r>
-          </w:p>
-        </w:tc>
-        <w:tc>
-          <w:tcPr/>
-          <w:p>
-            <w:pPr>
-              <w:pStyle w:val="Compact"/>
-            </w:pPr>
-            <w:r>
-              <w:t xml:space="preserve">writeback </w:t>
-            </w:r>
-            <w:r>
-              <w:rPr>
-                <w:rFonts w:hint="eastAsia"/>
-              </w:rPr>
-              <w:t xml:space="preserve">更頻繁，輕微增加</w:t>
-            </w:r>
-            <w:r>
-              <w:t xml:space="preserve"> I/O</w:t>
-            </w:r>
-          </w:p>
-        </w:tc>
-      </w:tr>
-      <w:tr>
-        <w:tc>
-          <w:tcPr/>
-          <w:p>
-            <w:pPr>
-              <w:pStyle w:val="Compact"/>
-            </w:pPr>
-            <w:r>
-              <w:t xml:space="preserve">minfree adj=950 </w:t>
-            </w:r>
-            <w:r>
-              <w:rPr>
-                <w:rFonts w:hint="eastAsia"/>
-              </w:rPr>
-              <w:t xml:space="preserve">提高</w:t>
-            </w:r>
-          </w:p>
-        </w:tc>
-        <w:tc>
-          <w:tcPr/>
-          <w:p>
-            <w:pPr>
-              <w:pStyle w:val="Compact"/>
-            </w:pPr>
-            <w:r>
-              <w:rPr>
-                <w:rFonts w:hint="eastAsia"/>
-              </w:rPr>
-              <w:t xml:space="preserve">低</w:t>
-            </w:r>
-          </w:p>
-        </w:tc>
-        <w:tc>
-          <w:tcPr/>
-          <w:p>
-            <w:pPr>
-              <w:pStyle w:val="Compact"/>
-            </w:pPr>
-            <w:r>
-              <w:rPr>
-                <w:rFonts w:hint="eastAsia"/>
-              </w:rPr>
-              <w:t xml:space="preserve">背景</w:t>
-            </w:r>
-            <w:r>
-              <w:t xml:space="preserve"> app cold start </w:t>
-            </w:r>
-            <w:r>
-              <w:rPr>
-                <w:rFonts w:hint="eastAsia"/>
-              </w:rPr>
-              <w:t xml:space="preserve">機率增加</w:t>
-            </w:r>
-          </w:p>
-        </w:tc>
-      </w:tr>
-      <w:tr>
-        <w:tc>
-          <w:tcPr/>
-          <w:p>
-            <w:pPr>
-              <w:pStyle w:val="Compact"/>
-            </w:pPr>
-            <w:r>
-              <w:t xml:space="preserve">vfs_cache_pressure 100→150</w:t>
-            </w:r>
-          </w:p>
-        </w:tc>
-        <w:tc>
-          <w:tcPr/>
-          <w:p>
-            <w:pPr>
-              <w:pStyle w:val="Compact"/>
-            </w:pPr>
-            <w:r>
-              <w:rPr>
-                <w:rFonts w:hint="eastAsia"/>
-              </w:rPr>
-              <w:t xml:space="preserve">低</w:t>
-            </w:r>
-          </w:p>
-        </w:tc>
-        <w:tc>
-          <w:tcPr/>
-          <w:p>
-            <w:pPr>
-              <w:pStyle w:val="Compact"/>
-            </w:pPr>
-            <w:r>
-              <w:rPr>
-                <w:rFonts w:hint="eastAsia"/>
-              </w:rPr>
-              <w:t xml:space="preserve">輕微</w:t>
-            </w:r>
-            <w:r>
-              <w:t xml:space="preserve"> cache miss</w:t>
-            </w:r>
-          </w:p>
-        </w:tc>
-      </w:tr>
-    </w:tbl>
-    <w:p>
-      <w:r>
-        <w:pict>
-          <v:rect style="width:0;height:1.5pt" o:hralign="center" o:hrstd="t" o:hr="t"/>
-        </w:pict>
-      </w:r>
-    </w:p>
-    <w:bookmarkEnd w:id="33"/>
-    <w:bookmarkEnd w:id="34"/>
-    <w:bookmarkStart w:id="35" w:name="oom-reaper-說明"/>
-    <w:p>
-      <w:pPr>
-        <w:pStyle w:val="Heading2"/>
-      </w:pPr>
-      <w:r>
-        <w:t xml:space="preserve">5. OOM Reaper </w:t>
-      </w:r>
-      <w:r>
-        <w:rPr>
-          <w:rFonts w:hint="eastAsia"/>
-        </w:rPr>
-        <w:t xml:space="preserve">說明</w:t>
-      </w:r>
-    </w:p>
-    <w:p>
-      <w:pPr>
-        <w:pStyle w:val="FirstParagraph"/>
-      </w:pPr>
-      <w:r>
-        <w:rPr>
-          <w:rStyle w:val="VerbatimChar"/>
-        </w:rPr>
-        <w:t xml:space="preserve">oom_reaper</w:t>
-      </w:r>
-      <w:r>
-        <w:t xml:space="preserve"> </w:t>
-      </w:r>
-      <w:r>
-        <w:rPr>
-          <w:rFonts w:hint="eastAsia"/>
-        </w:rPr>
-        <w:t xml:space="preserve">是</w:t>
-      </w:r>
-      <w:r>
-        <w:t xml:space="preserve"> kernel </w:t>
-      </w:r>
-      <w:r>
-        <w:rPr>
-          <w:rFonts w:hint="eastAsia"/>
-        </w:rPr>
-        <w:t xml:space="preserve">thread，在</w:t>
-      </w:r>
-      <w:r>
-        <w:t xml:space="preserve"> process </w:t>
-      </w:r>
-      <w:r>
-        <w:rPr>
-          <w:rFonts w:hint="eastAsia"/>
-        </w:rPr>
-        <w:t xml:space="preserve">被</w:t>
-      </w:r>
-      <w:r>
-        <w:t xml:space="preserve"> SIGKILL </w:t>
-      </w:r>
-      <w:r>
-        <w:rPr>
-          <w:rFonts w:hint="eastAsia"/>
-        </w:rPr>
-        <w:t xml:space="preserve">後快速回收</w:t>
-      </w:r>
-      <w:r>
-        <w:t xml:space="preserve"> anonymous </w:t>
-      </w:r>
-      <w:r>
-        <w:rPr>
-          <w:rFonts w:hint="eastAsia"/>
-        </w:rPr>
-        <w:t xml:space="preserve">memory，不等</w:t>
-      </w:r>
-      <w:r>
-        <w:t xml:space="preserve"> process </w:t>
-      </w:r>
-      <w:r>
-        <w:rPr>
-          <w:rFonts w:hint="eastAsia"/>
-        </w:rPr>
-        <w:t xml:space="preserve">自己</w:t>
-      </w:r>
-      <w:r>
-        <w:t xml:space="preserve"> exit。</w:t>
-      </w:r>
-    </w:p>
-    <w:tbl>
-      <w:tblPr>
-        <w:tblStyle w:val="Table"/>
-        <w:tblW w:type="auto" w:w="0"/>
-        <w:tblLook w:firstRow="1" w:lastRow="0" w:firstColumn="0" w:lastColumn="0" w:noHBand="0" w:noVBand="0" w:val="0020"/>
-      </w:tblPr>
-      <w:tblGrid>
-        <w:gridCol w:w="2640"/>
-        <w:gridCol w:w="2640"/>
-        <w:gridCol w:w="2640"/>
-      </w:tblGrid>
-      <w:tr>
-        <w:trPr>
-          <w:tblHeader w:val="on"/>
-        </w:trPr>
-        <w:tc>
-          <w:tcPr/>
-          <w:p>
-            <w:pPr>
-              <w:pStyle w:val="Compact"/>
-            </w:pPr>
           </w:p>
         </w:tc>
         <w:tc>
@@ -8497,8 +9207,8 @@
         </w:pict>
       </w:r>
     </w:p>
-    <w:bookmarkEnd w:id="35"/>
-    <w:bookmarkStart w:id="36" w:name="測試工具"/>
+    <w:bookmarkEnd w:id="36"/>
+    <w:bookmarkStart w:id="37" w:name="測試工具"/>
     <w:p>
       <w:pPr>
         <w:pStyle w:val="Heading2"/>
@@ -8551,8 +9261,8 @@
         </w:pict>
       </w:r>
     </w:p>
-    <w:bookmarkEnd w:id="36"/>
-    <w:bookmarkStart w:id="37" w:name="附件"/>
+    <w:bookmarkEnd w:id="37"/>
+    <w:bookmarkStart w:id="38" w:name="附件"/>
     <w:p>
       <w:pPr>
         <w:pStyle w:val="Heading2"/>
@@ -8645,8 +9355,8 @@
         <w:t xml:space="preserve">裝置端監控腳本</w:t>
       </w:r>
     </w:p>
-    <w:bookmarkEnd w:id="37"/>
     <w:bookmarkEnd w:id="38"/>
+    <w:bookmarkEnd w:id="39"/>
     <w:sectPr>
       <w:footnotePr>
         <w:numRestart w:val="eachSect"/>

</xml_diff>